<commit_message>
Synapse Interview questions and answers
Synapse Interview questions and answers
</commit_message>
<xml_diff>
--- a/Synapse_Interview_Questions.docx
+++ b/Synapse_Interview_Questions.docx
@@ -144,6 +144,9 @@
     </w:p>
     <w:p>
       <w:r>
+        <w:rPr>
+          <w:noProof/>
+        </w:rPr>
         <w:drawing>
           <wp:inline distT="0" distB="0" distL="0" distR="0" wp14:anchorId="3F598595" wp14:editId="76128EC8">
             <wp:extent cx="5943600" cy="2676525"/>
@@ -562,12 +565,15 @@
     <w:p>
       <w:r>
         <w:pict w14:anchorId="06AFD44B">
-          <v:rect id="_x0000_i1140" style="width:0;height:1.5pt" o:hralign="center" o:bullet="t" o:hrstd="t" o:hr="t" fillcolor="#a0a0a0" stroked="f"/>
+          <v:rect id="_x0000_i1026" style="width:0;height:1.5pt" o:hralign="center" o:bullet="t" o:hrstd="t" o:hr="t" fillcolor="#a0a0a0" stroked="f"/>
         </w:pict>
       </w:r>
     </w:p>
     <w:p>
       <w:r>
+        <w:rPr>
+          <w:noProof/>
+        </w:rPr>
         <w:drawing>
           <wp:inline distT="0" distB="0" distL="0" distR="0" wp14:anchorId="233CFB7D" wp14:editId="7588B20A">
             <wp:extent cx="2629267" cy="2781688"/>
@@ -701,7 +707,7 @@
       <w:r>
         <w:lastRenderedPageBreak/>
         <w:pict w14:anchorId="226FEC8F">
-          <v:rect id="_x0000_i1026" style="width:0;height:1.5pt" o:hralign="center" o:hrstd="t" o:hr="t" fillcolor="#a0a0a0" stroked="f"/>
+          <v:rect id="_x0000_i1027" style="width:0;height:1.5pt" o:hralign="center" o:hrstd="t" o:hr="t" fillcolor="#a0a0a0" stroked="f"/>
         </w:pict>
       </w:r>
       <w:r>
@@ -784,8 +790,13 @@
     </w:p>
     <w:p>
       <w:r>
-        <w:t>SECRET = 'sv=2021-06-08&amp;ss=b&amp;srt=sco&amp;sp=rwdlac&amp;se=2025-01-01T00:00:00Z&amp;st=2024-01-01T00:00:00Z&amp;spr=https&amp;sig=YOUR_SIGNATURE';</w:t>
-      </w:r>
+        <w:t>SECRET = 'sv=2021-06-08&amp;ss=b&amp;srt=sco&amp;sp=rwdlac&amp;se=2025-01-01T00:00:00Z&amp;st=2024-01-01T00:00:00Z&amp;spr=https&amp;sig=YOUR_SIGNATURE</w:t>
+      </w:r>
+      <w:proofErr w:type="gramStart"/>
+      <w:r>
+        <w:t>';</w:t>
+      </w:r>
+      <w:proofErr w:type="gramEnd"/>
     </w:p>
     <w:p/>
     <w:p>
@@ -916,8 +927,17 @@
           <w:b/>
           <w:bCs/>
         </w:rPr>
-        <w:t>CREATE EXTERNAL TABLE dbo.SalesData</w:t>
-      </w:r>
+        <w:t xml:space="preserve">CREATE EXTERNAL TABLE </w:t>
+      </w:r>
+      <w:proofErr w:type="gramStart"/>
+      <w:r>
+        <w:rPr>
+          <w:b/>
+          <w:bCs/>
+        </w:rPr>
+        <w:t>dbo.SalesData</w:t>
+      </w:r>
+      <w:proofErr w:type="gramEnd"/>
     </w:p>
     <w:p>
       <w:r>
@@ -931,7 +951,15 @@
     </w:p>
     <w:p>
       <w:r>
-        <w:t xml:space="preserve">    ProductName VARCHAR(100),</w:t>
+        <w:t xml:space="preserve">    ProductName </w:t>
+      </w:r>
+      <w:proofErr w:type="gramStart"/>
+      <w:r>
+        <w:t>VARCHAR(</w:t>
+      </w:r>
+      <w:proofErr w:type="gramEnd"/>
+      <w:r>
+        <w:t>100),</w:t>
       </w:r>
     </w:p>
     <w:p>
@@ -987,7 +1015,15 @@
     </w:p>
     <w:p>
       <w:r>
-        <w:t>FROM dbo.SalesData;</w:t>
+        <w:t xml:space="preserve">FROM </w:t>
+      </w:r>
+      <w:proofErr w:type="gramStart"/>
+      <w:r>
+        <w:t>dbo.SalesData</w:t>
+      </w:r>
+      <w:proofErr w:type="gramEnd"/>
+      <w:r>
+        <w:t>;</w:t>
       </w:r>
     </w:p>
     <w:p/>
@@ -998,8 +1034,13 @@
     </w:p>
     <w:p>
       <w:r>
-        <w:t>INSERT INTO dbo.InternalSalesData</w:t>
-      </w:r>
+        <w:t xml:space="preserve">INSERT INTO </w:t>
+      </w:r>
+      <w:proofErr w:type="gramStart"/>
+      <w:r>
+        <w:t>dbo.InternalSalesData</w:t>
+      </w:r>
+      <w:proofErr w:type="gramEnd"/>
     </w:p>
     <w:p>
       <w:r>
@@ -1009,7 +1050,15 @@
     </w:p>
     <w:p>
       <w:r>
-        <w:t>FROM dbo.SalesData;</w:t>
+        <w:t xml:space="preserve">FROM </w:t>
+      </w:r>
+      <w:proofErr w:type="gramStart"/>
+      <w:r>
+        <w:t>dbo.SalesData</w:t>
+      </w:r>
+      <w:proofErr w:type="gramEnd"/>
+      <w:r>
+        <w:t>;</w:t>
       </w:r>
     </w:p>
     <w:p/>
@@ -1099,7 +1148,15 @@
     </w:p>
     <w:p>
       <w:r>
-        <w:t>CREATE TABLE dbo.SalesData (</w:t>
+        <w:t xml:space="preserve">CREATE TABLE </w:t>
+      </w:r>
+      <w:proofErr w:type="gramStart"/>
+      <w:r>
+        <w:t>dbo.SalesData</w:t>
+      </w:r>
+      <w:proofErr w:type="gramEnd"/>
+      <w:r>
+        <w:t xml:space="preserve"> (</w:t>
       </w:r>
     </w:p>
     <w:p>
@@ -1109,7 +1166,15 @@
     </w:p>
     <w:p>
       <w:r>
-        <w:t xml:space="preserve">    ProductName VARCHAR(100),</w:t>
+        <w:t xml:space="preserve">    ProductName </w:t>
+      </w:r>
+      <w:proofErr w:type="gramStart"/>
+      <w:r>
+        <w:t>VARCHAR(</w:t>
+      </w:r>
+      <w:proofErr w:type="gramEnd"/>
+      <w:r>
+        <w:t>100),</w:t>
       </w:r>
     </w:p>
     <w:p>
@@ -1194,6 +1259,9 @@
     </w:p>
     <w:p>
       <w:r>
+        <w:rPr>
+          <w:noProof/>
+        </w:rPr>
         <w:lastRenderedPageBreak/>
         <w:drawing>
           <wp:inline distT="0" distB="0" distL="0" distR="0" wp14:anchorId="3C3E4384" wp14:editId="3BB0EF5A">
@@ -1235,7 +1303,7 @@
     <w:p>
       <w:r>
         <w:pict w14:anchorId="2D23B78F">
-          <v:rect id="_x0000_i1027" style="width:0;height:1.5pt" o:hralign="center" o:hrstd="t" o:hr="t" fillcolor="#a0a0a0" stroked="f"/>
+          <v:rect id="_x0000_i1028" style="width:0;height:1.5pt" o:hralign="center" o:hrstd="t" o:hr="t" fillcolor="#a0a0a0" stroked="f"/>
         </w:pict>
       </w:r>
     </w:p>
@@ -1322,8 +1390,13 @@
     </w:p>
     <w:p>
       <w:r>
-        <w:t>SECRET = 'sv=2021-06-08&amp;ss=b&amp;srt=sco&amp;sp=rwdlac&amp;se=2025-01-01T00:00:00Z&amp;st=2024-01-01T00:00:00Z&amp;spr=https&amp;sig=YOUR_SIGNATURE';</w:t>
-      </w:r>
+        <w:t>SECRET = 'sv=2021-06-08&amp;ss=b&amp;srt=sco&amp;sp=rwdlac&amp;se=2025-01-01T00:00:00Z&amp;st=2024-01-01T00:00:00Z&amp;spr=https&amp;sig=YOUR_SIGNATURE</w:t>
+      </w:r>
+      <w:proofErr w:type="gramStart"/>
+      <w:r>
+        <w:t>';</w:t>
+      </w:r>
+      <w:proofErr w:type="gramEnd"/>
     </w:p>
     <w:p>
       <w:r>
@@ -1393,7 +1466,7 @@
     <w:p>
       <w:r>
         <w:pict w14:anchorId="4E45BDB1">
-          <v:rect id="_x0000_i1028" style="width:0;height:1.5pt" o:hralign="center" o:hrstd="t" o:hr="t" fillcolor="#a0a0a0" stroked="f"/>
+          <v:rect id="_x0000_i1029" style="width:0;height:1.5pt" o:hralign="center" o:hrstd="t" o:hr="t" fillcolor="#a0a0a0" stroked="f"/>
         </w:pict>
       </w:r>
     </w:p>
@@ -1471,8 +1544,17 @@
           <w:b/>
           <w:bCs/>
         </w:rPr>
-        <w:t>COPY INTO dbo.SalesData</w:t>
-      </w:r>
+        <w:t xml:space="preserve">COPY INTO </w:t>
+      </w:r>
+      <w:proofErr w:type="gramStart"/>
+      <w:r>
+        <w:rPr>
+          <w:b/>
+          <w:bCs/>
+        </w:rPr>
+        <w:t>dbo.SalesData</w:t>
+      </w:r>
+      <w:proofErr w:type="gramEnd"/>
     </w:p>
     <w:p>
       <w:r>
@@ -1590,7 +1672,7 @@
     <w:p>
       <w:r>
         <w:pict w14:anchorId="648B19D9">
-          <v:rect id="_x0000_i1029" style="width:0;height:1.5pt" o:hralign="center" o:hrstd="t" o:hr="t" fillcolor="#a0a0a0" stroked="f"/>
+          <v:rect id="_x0000_i1030" style="width:0;height:1.5pt" o:hralign="center" o:hrstd="t" o:hr="t" fillcolor="#a0a0a0" stroked="f"/>
         </w:pict>
       </w:r>
     </w:p>
@@ -1673,8 +1755,13 @@
     <w:p>
       <w:r>
         <w:lastRenderedPageBreak/>
-        <w:t>WHERE session_id = SESSION_ID();</w:t>
-      </w:r>
+        <w:t>WHERE session_id = SESSION_</w:t>
+      </w:r>
+      <w:proofErr w:type="gramStart"/>
+      <w:r>
+        <w:t>ID();</w:t>
+      </w:r>
+      <w:proofErr w:type="gramEnd"/>
     </w:p>
     <w:p>
       <w:r>
@@ -1719,23 +1806,41 @@
     </w:p>
     <w:p>
       <w:r>
-        <w:t xml:space="preserve">    COUNT(*)</w:t>
-      </w:r>
-    </w:p>
-    <w:p>
-      <w:r>
-        <w:t>FROM dbo.SalesData</w:t>
-      </w:r>
-    </w:p>
-    <w:p>
-      <w:r>
-        <w:t>GROUP BY distribution_id;</w:t>
-      </w:r>
+        <w:t xml:space="preserve">    </w:t>
+      </w:r>
+      <w:proofErr w:type="gramStart"/>
+      <w:r>
+        <w:t>COUNT(</w:t>
+      </w:r>
+      <w:proofErr w:type="gramEnd"/>
+      <w:r>
+        <w:t>*)</w:t>
+      </w:r>
+    </w:p>
+    <w:p>
+      <w:r>
+        <w:t xml:space="preserve">FROM </w:t>
+      </w:r>
+      <w:proofErr w:type="gramStart"/>
+      <w:r>
+        <w:t>dbo.SalesData</w:t>
+      </w:r>
+      <w:proofErr w:type="gramEnd"/>
+    </w:p>
+    <w:p>
+      <w:r>
+        <w:t>GROUP BY distribution_</w:t>
+      </w:r>
+      <w:proofErr w:type="gramStart"/>
+      <w:r>
+        <w:t>id;</w:t>
+      </w:r>
+      <w:proofErr w:type="gramEnd"/>
     </w:p>
     <w:p>
       <w:r>
         <w:pict w14:anchorId="476B7EE9">
-          <v:rect id="_x0000_i1030" style="width:0;height:1.5pt" o:hralign="center" o:hrstd="t" o:hr="t" fillcolor="#a0a0a0" stroked="f"/>
+          <v:rect id="_x0000_i1031" style="width:0;height:1.5pt" o:hralign="center" o:hrstd="t" o:hr="t" fillcolor="#a0a0a0" stroked="f"/>
         </w:pict>
       </w:r>
     </w:p>
@@ -1987,7 +2092,15 @@
           </w:tcPr>
           <w:p>
             <w:r>
-              <w:t>Ensure data types match table schema</w:t>
+              <w:t xml:space="preserve">Ensure data </w:t>
+            </w:r>
+            <w:proofErr w:type="gramStart"/>
+            <w:r>
+              <w:t>types</w:t>
+            </w:r>
+            <w:proofErr w:type="gramEnd"/>
+            <w:r>
+              <w:t xml:space="preserve"> match table schema</w:t>
             </w:r>
           </w:p>
         </w:tc>
@@ -2037,7 +2150,7 @@
     <w:p>
       <w:r>
         <w:pict w14:anchorId="01F08BC3">
-          <v:rect id="_x0000_i1031" style="width:0;height:1.5pt" o:hralign="center" o:hrstd="t" o:hr="t" fillcolor="#a0a0a0" stroked="f"/>
+          <v:rect id="_x0000_i1032" style="width:0;height:1.5pt" o:hralign="center" o:hrstd="t" o:hr="t" fillcolor="#a0a0a0" stroked="f"/>
         </w:pict>
       </w:r>
     </w:p>
@@ -2099,7 +2212,15 @@
     </w:p>
     <w:p>
       <w:r>
-        <w:t>CREATE TABLE dbo.SalesData (</w:t>
+        <w:t xml:space="preserve">CREATE TABLE </w:t>
+      </w:r>
+      <w:proofErr w:type="gramStart"/>
+      <w:r>
+        <w:t>dbo.SalesData</w:t>
+      </w:r>
+      <w:proofErr w:type="gramEnd"/>
+      <w:r>
+        <w:t xml:space="preserve"> (</w:t>
       </w:r>
     </w:p>
     <w:p>
@@ -2109,7 +2230,15 @@
     </w:p>
     <w:p>
       <w:r>
-        <w:t xml:space="preserve">    ProductName VARCHAR(100),</w:t>
+        <w:t xml:space="preserve">    ProductName </w:t>
+      </w:r>
+      <w:proofErr w:type="gramStart"/>
+      <w:r>
+        <w:t>VARCHAR(</w:t>
+      </w:r>
+      <w:proofErr w:type="gramEnd"/>
+      <w:r>
+        <w:t>100),</w:t>
       </w:r>
     </w:p>
     <w:p>
@@ -2198,8 +2327,13 @@
     </w:p>
     <w:p>
       <w:r>
-        <w:t>SECRET = 'sv=2021-06-08&amp;ss=b&amp;srt=sco&amp;sp=rwdlac&amp;se=2025-01-01T00:00:00Z&amp;st=2024-01-01T00:00:00Z&amp;spr=https&amp;sig=YOUR_SIGNATURE';</w:t>
-      </w:r>
+        <w:t>SECRET = 'sv=2021-06-08&amp;ss=b&amp;srt=sco&amp;sp=rwdlac&amp;se=2025-01-01T00:00:00Z&amp;st=2024-01-01T00:00:00Z&amp;spr=https&amp;sig=YOUR_SIGNATURE</w:t>
+      </w:r>
+      <w:proofErr w:type="gramStart"/>
+      <w:r>
+        <w:t>';</w:t>
+      </w:r>
+      <w:proofErr w:type="gramEnd"/>
     </w:p>
     <w:p>
       <w:pPr>
@@ -2236,8 +2370,13 @@
     </w:p>
     <w:p>
       <w:r>
-        <w:t>COPY INTO dbo.SalesData</w:t>
-      </w:r>
+        <w:t xml:space="preserve">COPY INTO </w:t>
+      </w:r>
+      <w:proofErr w:type="gramStart"/>
+      <w:r>
+        <w:t>dbo.SalesData</w:t>
+      </w:r>
+      <w:proofErr w:type="gramEnd"/>
     </w:p>
     <w:p>
       <w:r>
@@ -2285,7 +2424,7 @@
     <w:p>
       <w:r>
         <w:pict w14:anchorId="3AD2DCFA">
-          <v:rect id="_x0000_i1032" style="width:0;height:1.5pt" o:hralign="center" o:hrstd="t" o:hr="t" fillcolor="#a0a0a0" stroked="f"/>
+          <v:rect id="_x0000_i1033" style="width:0;height:1.5pt" o:hralign="center" o:hrstd="t" o:hr="t" fillcolor="#a0a0a0" stroked="f"/>
         </w:pict>
       </w:r>
     </w:p>
@@ -2437,7 +2576,15 @@
     </w:p>
     <w:p>
       <w:r>
-        <w:t>This colusterd column create on fact tables.</w:t>
+        <w:t xml:space="preserve">This colusterd column </w:t>
+      </w:r>
+      <w:proofErr w:type="gramStart"/>
+      <w:r>
+        <w:t>create</w:t>
+      </w:r>
+      <w:proofErr w:type="gramEnd"/>
+      <w:r>
+        <w:t xml:space="preserve"> on fact tables.</w:t>
       </w:r>
     </w:p>
     <w:p>
@@ -2687,7 +2834,25 @@
           <w:bCs/>
           <w:highlight w:val="yellow"/>
         </w:rPr>
-        <w:t>CREATE TABLE [dbo].[SalesData]</w:t>
+        <w:t>CREATE TABLE [dbo</w:t>
+      </w:r>
+      <w:proofErr w:type="gramStart"/>
+      <w:r>
+        <w:rPr>
+          <w:b/>
+          <w:bCs/>
+          <w:highlight w:val="yellow"/>
+        </w:rPr>
+        <w:t>].[</w:t>
+      </w:r>
+      <w:proofErr w:type="gramEnd"/>
+      <w:r>
+        <w:rPr>
+          <w:b/>
+          <w:bCs/>
+          <w:highlight w:val="yellow"/>
+        </w:rPr>
+        <w:t>SalesData]</w:t>
       </w:r>
     </w:p>
     <w:p>
@@ -3050,12 +3215,95 @@
           <w:b/>
           <w:bCs/>
         </w:rPr>
-        <w:t>The table size  on disk  2 GB.TABLE has frequest insert, update and delete operations(fact tables)</w:t>
+        <w:t xml:space="preserve">The table </w:t>
+      </w:r>
+      <w:proofErr w:type="gramStart"/>
+      <w:r>
+        <w:rPr>
+          <w:b/>
+          <w:bCs/>
+        </w:rPr>
+        <w:t>size  on</w:t>
+      </w:r>
+      <w:proofErr w:type="gramEnd"/>
+      <w:r>
+        <w:rPr>
+          <w:b/>
+          <w:bCs/>
+        </w:rPr>
+        <w:t xml:space="preserve"> </w:t>
+      </w:r>
+      <w:proofErr w:type="gramStart"/>
+      <w:r>
+        <w:rPr>
+          <w:b/>
+          <w:bCs/>
+        </w:rPr>
+        <w:t>disk  2</w:t>
+      </w:r>
+      <w:proofErr w:type="gramEnd"/>
+      <w:r>
+        <w:rPr>
+          <w:b/>
+          <w:bCs/>
+        </w:rPr>
+        <w:t xml:space="preserve"> </w:t>
+      </w:r>
+      <w:proofErr w:type="gramStart"/>
+      <w:r>
+        <w:rPr>
+          <w:b/>
+          <w:bCs/>
+        </w:rPr>
+        <w:t>GB.TABLE</w:t>
+      </w:r>
+      <w:proofErr w:type="gramEnd"/>
+      <w:r>
+        <w:rPr>
+          <w:b/>
+          <w:bCs/>
+        </w:rPr>
+        <w:t xml:space="preserve"> has </w:t>
+      </w:r>
+      <w:proofErr w:type="gramStart"/>
+      <w:r>
+        <w:rPr>
+          <w:b/>
+          <w:bCs/>
+        </w:rPr>
+        <w:t>frequest</w:t>
+      </w:r>
+      <w:proofErr w:type="gramEnd"/>
+      <w:r>
+        <w:rPr>
+          <w:b/>
+          <w:bCs/>
+        </w:rPr>
+        <w:t xml:space="preserve"> insert, update and delete </w:t>
+      </w:r>
+      <w:proofErr w:type="gramStart"/>
+      <w:r>
+        <w:rPr>
+          <w:b/>
+          <w:bCs/>
+        </w:rPr>
+        <w:t>operations(</w:t>
+      </w:r>
+      <w:proofErr w:type="gramEnd"/>
+      <w:r>
+        <w:rPr>
+          <w:b/>
+          <w:bCs/>
+        </w:rPr>
+        <w:t>fact tables)</w:t>
       </w:r>
     </w:p>
     <w:p/>
     <w:p>
       <w:r>
+        <w:rPr>
+          <w:noProof/>
+        </w:rPr>
         <w:lastRenderedPageBreak/>
         <w:drawing>
           <wp:inline distT="0" distB="0" distL="0" distR="0" wp14:anchorId="3427243E" wp14:editId="5CA63BF5">
@@ -3096,6 +3344,9 @@
     </w:p>
     <w:p>
       <w:r>
+        <w:rPr>
+          <w:noProof/>
+        </w:rPr>
         <w:drawing>
           <wp:inline distT="0" distB="0" distL="0" distR="0" wp14:anchorId="26C224AE" wp14:editId="0105F8E3">
             <wp:extent cx="3238952" cy="390580"/>
@@ -3174,7 +3425,23 @@
           <w:b/>
           <w:bCs/>
         </w:rPr>
-        <w:t>Replicate table used for Dimension tables/</w:t>
+        <w:t xml:space="preserve">Replicate </w:t>
+      </w:r>
+      <w:proofErr w:type="gramStart"/>
+      <w:r>
+        <w:rPr>
+          <w:b/>
+          <w:bCs/>
+        </w:rPr>
+        <w:t>table</w:t>
+      </w:r>
+      <w:proofErr w:type="gramEnd"/>
+      <w:r>
+        <w:rPr>
+          <w:b/>
+          <w:bCs/>
+        </w:rPr>
+        <w:t xml:space="preserve"> used for Dimension tables/</w:t>
       </w:r>
       <w:r>
         <w:rPr>
@@ -3201,6 +3468,9 @@
     <w:p/>
     <w:p>
       <w:r>
+        <w:rPr>
+          <w:noProof/>
+        </w:rPr>
         <w:drawing>
           <wp:inline distT="0" distB="0" distL="0" distR="0" wp14:anchorId="64FD0E65" wp14:editId="5B1E331F">
             <wp:extent cx="2848373" cy="1286054"/>
@@ -3636,7 +3906,15 @@
         <w:br/>
       </w:r>
       <w:r>
-        <w:t>CTAS (Create Table As Select) is used to create a new table based on the result of a SELECT query.</w:t>
+        <w:t xml:space="preserve">CTAS (Create Table </w:t>
+      </w:r>
+      <w:proofErr w:type="gramStart"/>
+      <w:r>
+        <w:t>As</w:t>
+      </w:r>
+      <w:proofErr w:type="gramEnd"/>
+      <w:r>
+        <w:t xml:space="preserve"> Select) is used to create a new table based on the result of a SELECT query.</w:t>
       </w:r>
     </w:p>
     <w:p>
@@ -3763,8 +4041,17 @@
           <w:b/>
           <w:bCs/>
         </w:rPr>
-        <w:t>FROM ExistingTable;</w:t>
-      </w:r>
+        <w:t xml:space="preserve">FROM </w:t>
+      </w:r>
+      <w:proofErr w:type="gramStart"/>
+      <w:r>
+        <w:rPr>
+          <w:b/>
+          <w:bCs/>
+        </w:rPr>
+        <w:t>ExistingTable;</w:t>
+      </w:r>
+      <w:proofErr w:type="gramEnd"/>
     </w:p>
     <w:p>
       <w:pPr>
@@ -4084,8 +4371,33 @@
           <w:b/>
           <w:bCs/>
         </w:rPr>
-        <w:t>ON target.BusinessKey = source.BusinessKey</w:t>
-      </w:r>
+        <w:t xml:space="preserve">ON </w:t>
+      </w:r>
+      <w:proofErr w:type="gramStart"/>
+      <w:r>
+        <w:rPr>
+          <w:b/>
+          <w:bCs/>
+        </w:rPr>
+        <w:t>target.BusinessKey</w:t>
+      </w:r>
+      <w:proofErr w:type="gramEnd"/>
+      <w:r>
+        <w:rPr>
+          <w:b/>
+          <w:bCs/>
+        </w:rPr>
+        <w:t xml:space="preserve"> = </w:t>
+      </w:r>
+      <w:proofErr w:type="gramStart"/>
+      <w:r>
+        <w:rPr>
+          <w:b/>
+          <w:bCs/>
+        </w:rPr>
+        <w:t>source.BusinessKey</w:t>
+      </w:r>
+      <w:proofErr w:type="gramEnd"/>
     </w:p>
     <w:p>
       <w:pPr>
@@ -4114,7 +4426,23 @@
           <w:b/>
           <w:bCs/>
         </w:rPr>
-        <w:t xml:space="preserve">    UPDATE SET EndDate = GETDATE()</w:t>
+        <w:t xml:space="preserve">    UPDATE SET EndDate = </w:t>
+      </w:r>
+      <w:proofErr w:type="gramStart"/>
+      <w:r>
+        <w:rPr>
+          <w:b/>
+          <w:bCs/>
+        </w:rPr>
+        <w:t>GETDATE(</w:t>
+      </w:r>
+      <w:proofErr w:type="gramEnd"/>
+      <w:r>
+        <w:rPr>
+          <w:b/>
+          <w:bCs/>
+        </w:rPr>
+        <w:t>)</w:t>
       </w:r>
     </w:p>
     <w:p>
@@ -4159,8 +4487,65 @@
           <w:b/>
           <w:bCs/>
         </w:rPr>
-        <w:t xml:space="preserve">    VALUES (source.BusinessKey, source.Value, GETDATE());</w:t>
-      </w:r>
+        <w:t xml:space="preserve">    VALUES (</w:t>
+      </w:r>
+      <w:proofErr w:type="gramStart"/>
+      <w:r>
+        <w:rPr>
+          <w:b/>
+          <w:bCs/>
+        </w:rPr>
+        <w:t>source.BusinessKey</w:t>
+      </w:r>
+      <w:proofErr w:type="gramEnd"/>
+      <w:r>
+        <w:rPr>
+          <w:b/>
+          <w:bCs/>
+        </w:rPr>
+        <w:t xml:space="preserve">, </w:t>
+      </w:r>
+      <w:proofErr w:type="gramStart"/>
+      <w:r>
+        <w:rPr>
+          <w:b/>
+          <w:bCs/>
+        </w:rPr>
+        <w:t>source.Value</w:t>
+      </w:r>
+      <w:proofErr w:type="gramEnd"/>
+      <w:r>
+        <w:rPr>
+          <w:b/>
+          <w:bCs/>
+        </w:rPr>
+        <w:t xml:space="preserve">, </w:t>
+      </w:r>
+      <w:proofErr w:type="gramStart"/>
+      <w:r>
+        <w:rPr>
+          <w:b/>
+          <w:bCs/>
+        </w:rPr>
+        <w:t>GETDATE(</w:t>
+      </w:r>
+      <w:proofErr w:type="gramEnd"/>
+      <w:r>
+        <w:rPr>
+          <w:b/>
+          <w:bCs/>
+        </w:rPr>
+        <w:t>)</w:t>
+      </w:r>
+      <w:proofErr w:type="gramStart"/>
+      <w:r>
+        <w:rPr>
+          <w:b/>
+          <w:bCs/>
+        </w:rPr>
+        <w:t>);</w:t>
+      </w:r>
+      <w:proofErr w:type="gramEnd"/>
     </w:p>
     <w:p>
       <w:pPr>
@@ -4259,7 +4644,7 @@
     <w:p>
       <w:r>
         <w:pict w14:anchorId="71ECE39F">
-          <v:rect id="_x0000_i1033" style="width:0;height:1.5pt" o:hralign="center" o:hrstd="t" o:hr="t" fillcolor="#a0a0a0" stroked="f"/>
+          <v:rect id="_x0000_i1034" style="width:0;height:1.5pt" o:hralign="center" o:hrstd="t" o:hr="t" fillcolor="#a0a0a0" stroked="f"/>
         </w:pict>
       </w:r>
     </w:p>
@@ -4318,7 +4703,7 @@
     <w:p>
       <w:r>
         <w:pict w14:anchorId="27E52D38">
-          <v:rect id="_x0000_i1034" style="width:0;height:1.5pt" o:hralign="center" o:hrstd="t" o:hr="t" fillcolor="#a0a0a0" stroked="f"/>
+          <v:rect id="_x0000_i1035" style="width:0;height:1.5pt" o:hralign="center" o:hrstd="t" o:hr="t" fillcolor="#a0a0a0" stroked="f"/>
         </w:pict>
       </w:r>
     </w:p>
@@ -4445,7 +4830,7 @@
     <w:p>
       <w:r>
         <w:pict w14:anchorId="1E048AE6">
-          <v:rect id="_x0000_i1035" style="width:0;height:1.5pt" o:hralign="center" o:hrstd="t" o:hr="t" fillcolor="#a0a0a0" stroked="f"/>
+          <v:rect id="_x0000_i1036" style="width:0;height:1.5pt" o:hralign="center" o:hrstd="t" o:hr="t" fillcolor="#a0a0a0" stroked="f"/>
         </w:pict>
       </w:r>
     </w:p>
@@ -4605,7 +4990,7 @@
     <w:p>
       <w:r>
         <w:pict w14:anchorId="5D021DB5">
-          <v:rect id="_x0000_i1036" style="width:0;height:1.5pt" o:hralign="center" o:hrstd="t" o:hr="t" fillcolor="#a0a0a0" stroked="f"/>
+          <v:rect id="_x0000_i1037" style="width:0;height:1.5pt" o:hralign="center" o:hrstd="t" o:hr="t" fillcolor="#a0a0a0" stroked="f"/>
         </w:pict>
       </w:r>
     </w:p>
@@ -4696,7 +5081,7 @@
     <w:p>
       <w:r>
         <w:pict w14:anchorId="353A8644">
-          <v:rect id="_x0000_i1037" style="width:0;height:1.5pt" o:hralign="center" o:hrstd="t" o:hr="t" fillcolor="#a0a0a0" stroked="f"/>
+          <v:rect id="_x0000_i1038" style="width:0;height:1.5pt" o:hralign="center" o:hrstd="t" o:hr="t" fillcolor="#a0a0a0" stroked="f"/>
         </w:pict>
       </w:r>
     </w:p>
@@ -4784,7 +5169,7 @@
     <w:p>
       <w:r>
         <w:pict w14:anchorId="213DAC8E">
-          <v:rect id="_x0000_i1038" style="width:0;height:1.5pt" o:hralign="center" o:hrstd="t" o:hr="t" fillcolor="#a0a0a0" stroked="f"/>
+          <v:rect id="_x0000_i1039" style="width:0;height:1.5pt" o:hralign="center" o:hrstd="t" o:hr="t" fillcolor="#a0a0a0" stroked="f"/>
         </w:pict>
       </w:r>
     </w:p>
@@ -4800,7 +5185,23 @@
           <w:b/>
           <w:bCs/>
         </w:rPr>
-        <w:t>You have a large dataset with billions of rows. How would you improve query performance?</w:t>
+        <w:t xml:space="preserve">You have a large dataset with billions of rows. How would you improve </w:t>
+      </w:r>
+      <w:proofErr w:type="gramStart"/>
+      <w:r>
+        <w:rPr>
+          <w:b/>
+          <w:bCs/>
+        </w:rPr>
+        <w:t>query</w:t>
+      </w:r>
+      <w:proofErr w:type="gramEnd"/>
+      <w:r>
+        <w:rPr>
+          <w:b/>
+          <w:bCs/>
+        </w:rPr>
+        <w:t xml:space="preserve"> performance?</w:t>
       </w:r>
     </w:p>
     <w:p>
@@ -4876,7 +5277,7 @@
     <w:p>
       <w:r>
         <w:pict w14:anchorId="561192DC">
-          <v:rect id="_x0000_i1039" style="width:0;height:1.5pt" o:hralign="center" o:hrstd="t" o:hr="t" fillcolor="#a0a0a0" stroked="f"/>
+          <v:rect id="_x0000_i1040" style="width:0;height:1.5pt" o:hralign="center" o:hrstd="t" o:hr="t" fillcolor="#a0a0a0" stroked="f"/>
         </w:pict>
       </w:r>
     </w:p>
@@ -5052,7 +5453,7 @@
     <w:p>
       <w:r>
         <w:pict w14:anchorId="436D4DDF">
-          <v:rect id="_x0000_i1040" style="width:0;height:1.5pt" o:hralign="center" o:hrstd="t" o:hr="t" fillcolor="#a0a0a0" stroked="f"/>
+          <v:rect id="_x0000_i1041" style="width:0;height:1.5pt" o:hralign="center" o:hrstd="t" o:hr="t" fillcolor="#a0a0a0" stroked="f"/>
         </w:pict>
       </w:r>
       <w:r>
@@ -5145,7 +5546,7 @@
     <w:p>
       <w:r>
         <w:pict w14:anchorId="53514A23">
-          <v:rect id="_x0000_i1041" style="width:0;height:1.5pt" o:hralign="center" o:hrstd="t" o:hr="t" fillcolor="#a0a0a0" stroked="f"/>
+          <v:rect id="_x0000_i1042" style="width:0;height:1.5pt" o:hralign="center" o:hrstd="t" o:hr="t" fillcolor="#a0a0a0" stroked="f"/>
         </w:pict>
       </w:r>
     </w:p>
@@ -5497,7 +5898,7 @@
     <w:p>
       <w:r>
         <w:pict w14:anchorId="4C87175E">
-          <v:rect id="_x0000_i1042" style="width:0;height:1.5pt" o:hralign="center" o:hrstd="t" o:hr="t" fillcolor="#a0a0a0" stroked="f"/>
+          <v:rect id="_x0000_i1043" style="width:0;height:1.5pt" o:hralign="center" o:hrstd="t" o:hr="t" fillcolor="#a0a0a0" stroked="f"/>
         </w:pict>
       </w:r>
     </w:p>
@@ -5564,7 +5965,7 @@
     <w:p>
       <w:r>
         <w:pict w14:anchorId="7598595F">
-          <v:rect id="_x0000_i1043" style="width:0;height:1.5pt" o:hralign="center" o:hrstd="t" o:hr="t" fillcolor="#a0a0a0" stroked="f"/>
+          <v:rect id="_x0000_i1044" style="width:0;height:1.5pt" o:hralign="center" o:hrstd="t" o:hr="t" fillcolor="#a0a0a0" stroked="f"/>
         </w:pict>
       </w:r>
     </w:p>
@@ -5636,7 +6037,7 @@
     <w:p>
       <w:r>
         <w:pict w14:anchorId="70A984C0">
-          <v:rect id="_x0000_i1044" style="width:0;height:1.5pt" o:hralign="center" o:hrstd="t" o:hr="t" fillcolor="#a0a0a0" stroked="f"/>
+          <v:rect id="_x0000_i1045" style="width:0;height:1.5pt" o:hralign="center" o:hrstd="t" o:hr="t" fillcolor="#a0a0a0" stroked="f"/>
         </w:pict>
       </w:r>
     </w:p>
@@ -5773,7 +6174,23 @@
           <w:b/>
           <w:bCs/>
         </w:rPr>
-        <w:t>CTAS (Create Table As Select)</w:t>
+        <w:t xml:space="preserve">CTAS (Create Table </w:t>
+      </w:r>
+      <w:proofErr w:type="gramStart"/>
+      <w:r>
+        <w:rPr>
+          <w:b/>
+          <w:bCs/>
+        </w:rPr>
+        <w:t>As</w:t>
+      </w:r>
+      <w:proofErr w:type="gramEnd"/>
+      <w:r>
+        <w:rPr>
+          <w:b/>
+          <w:bCs/>
+        </w:rPr>
+        <w:t xml:space="preserve"> Select)</w:t>
       </w:r>
       <w:r>
         <w:t xml:space="preserve"> to create materialized views for frequently accessed data.</w:t>
@@ -5924,7 +6341,7 @@
     <w:p>
       <w:r>
         <w:pict w14:anchorId="3256A1AD">
-          <v:rect id="_x0000_i1045" style="width:0;height:1.5pt" o:hralign="center" o:hrstd="t" o:hr="t" fillcolor="#a0a0a0" stroked="f"/>
+          <v:rect id="_x0000_i1046" style="width:0;height:1.5pt" o:hralign="center" o:hrstd="t" o:hr="t" fillcolor="#a0a0a0" stroked="f"/>
         </w:pict>
       </w:r>
     </w:p>
@@ -6461,7 +6878,7 @@
     <w:p>
       <w:r>
         <w:pict w14:anchorId="6A328919">
-          <v:rect id="_x0000_i1046" style="width:0;height:1.5pt" o:hralign="center" o:hrstd="t" o:hr="t" fillcolor="#a0a0a0" stroked="f"/>
+          <v:rect id="_x0000_i1047" style="width:0;height:1.5pt" o:hralign="center" o:hrstd="t" o:hr="t" fillcolor="#a0a0a0" stroked="f"/>
         </w:pict>
       </w:r>
     </w:p>
@@ -6544,7 +6961,7 @@
     <w:p>
       <w:r>
         <w:pict w14:anchorId="2FC2869C">
-          <v:rect id="_x0000_i1047" style="width:0;height:1.5pt" o:hralign="center" o:hrstd="t" o:hr="t" fillcolor="#a0a0a0" stroked="f"/>
+          <v:rect id="_x0000_i1048" style="width:0;height:1.5pt" o:hralign="center" o:hrstd="t" o:hr="t" fillcolor="#a0a0a0" stroked="f"/>
         </w:pict>
       </w:r>
     </w:p>
@@ -6627,7 +7044,7 @@
     <w:p>
       <w:r>
         <w:pict w14:anchorId="54B2D22E">
-          <v:rect id="_x0000_i1048" style="width:0;height:1.5pt" o:hralign="center" o:hrstd="t" o:hr="t" fillcolor="#a0a0a0" stroked="f"/>
+          <v:rect id="_x0000_i1049" style="width:0;height:1.5pt" o:hralign="center" o:hrstd="t" o:hr="t" fillcolor="#a0a0a0" stroked="f"/>
         </w:pict>
       </w:r>
     </w:p>
@@ -6707,13 +7124,21 @@
         <w:t>Example:</w:t>
       </w:r>
       <w:r>
-        <w:t xml:space="preserve"> A social media platform handling user interactions, ad performance, and content delivery</w:t>
+        <w:t xml:space="preserve"> A </w:t>
+      </w:r>
+      <w:proofErr w:type="gramStart"/>
+      <w:r>
+        <w:t>social media platform handling user interactions</w:t>
+      </w:r>
+      <w:proofErr w:type="gramEnd"/>
+      <w:r>
+        <w:t>, ad performance, and content delivery</w:t>
       </w:r>
     </w:p>
     <w:p>
       <w:r>
         <w:pict w14:anchorId="6B3621CC">
-          <v:rect id="_x0000_i1049" style="width:0;height:1.5pt" o:hralign="center" o:hrstd="t" o:hr="t" fillcolor="#a0a0a0" stroked="f"/>
+          <v:rect id="_x0000_i1050" style="width:0;height:1.5pt" o:hralign="center" o:hrstd="t" o:hr="t" fillcolor="#a0a0a0" stroked="f"/>
         </w:pict>
       </w:r>
     </w:p>
@@ -7103,7 +7528,7 @@
     <w:p>
       <w:r>
         <w:pict w14:anchorId="3475C1CF">
-          <v:rect id="_x0000_i1050" style="width:0;height:1.5pt" o:hralign="center" o:hrstd="t" o:hr="t" fillcolor="#a0a0a0" stroked="f"/>
+          <v:rect id="_x0000_i1051" style="width:0;height:1.5pt" o:hralign="center" o:hrstd="t" o:hr="t" fillcolor="#a0a0a0" stroked="f"/>
         </w:pict>
       </w:r>
     </w:p>
@@ -7215,7 +7640,7 @@
     <w:p>
       <w:r>
         <w:pict w14:anchorId="2499028F">
-          <v:rect id="_x0000_i1051" style="width:0;height:1.5pt" o:hralign="center" o:hrstd="t" o:hr="t" fillcolor="#a0a0a0" stroked="f"/>
+          <v:rect id="_x0000_i1052" style="width:0;height:1.5pt" o:hralign="center" o:hrstd="t" o:hr="t" fillcolor="#a0a0a0" stroked="f"/>
         </w:pict>
       </w:r>
     </w:p>
@@ -7406,8 +7831,13 @@
             <w:hideMark/>
           </w:tcPr>
           <w:p>
-            <w:r>
-              <w:t>Copies data from source to destination (supports 90+ connectors)</w:t>
+            <w:proofErr w:type="gramStart"/>
+            <w:r>
+              <w:t>Copies</w:t>
+            </w:r>
+            <w:proofErr w:type="gramEnd"/>
+            <w:r>
+              <w:t xml:space="preserve"> data from source to destination (supports 90+ connectors)</w:t>
             </w:r>
           </w:p>
         </w:tc>
@@ -7473,7 +7903,7 @@
     <w:p>
       <w:r>
         <w:pict w14:anchorId="3BB6590F">
-          <v:rect id="_x0000_i1052" style="width:0;height:1.5pt" o:hralign="center" o:hrstd="t" o:hr="t" fillcolor="#a0a0a0" stroked="f"/>
+          <v:rect id="_x0000_i1053" style="width:0;height:1.5pt" o:hralign="center" o:hrstd="t" o:hr="t" fillcolor="#a0a0a0" stroked="f"/>
         </w:pict>
       </w:r>
     </w:p>
@@ -7725,7 +8155,7 @@
     <w:p>
       <w:r>
         <w:pict w14:anchorId="5D837242">
-          <v:rect id="_x0000_i1053" style="width:0;height:1.5pt" o:hralign="center" o:hrstd="t" o:hr="t" fillcolor="#a0a0a0" stroked="f"/>
+          <v:rect id="_x0000_i1054" style="width:0;height:1.5pt" o:hralign="center" o:hrstd="t" o:hr="t" fillcolor="#a0a0a0" stroked="f"/>
         </w:pict>
       </w:r>
     </w:p>
@@ -8025,7 +8455,7 @@
     <w:p>
       <w:r>
         <w:pict w14:anchorId="16C337B4">
-          <v:rect id="_x0000_i1054" style="width:0;height:1.5pt" o:hralign="center" o:hrstd="t" o:hr="t" fillcolor="#a0a0a0" stroked="f"/>
+          <v:rect id="_x0000_i1055" style="width:0;height:1.5pt" o:hralign="center" o:hrstd="t" o:hr="t" fillcolor="#a0a0a0" stroked="f"/>
         </w:pict>
       </w:r>
     </w:p>
@@ -8166,8 +8596,13 @@
             <w:hideMark/>
           </w:tcPr>
           <w:p>
-            <w:r>
-              <w:t>Executes activities for each item in a collection</w:t>
+            <w:proofErr w:type="gramStart"/>
+            <w:r>
+              <w:t>Executes</w:t>
+            </w:r>
+            <w:proofErr w:type="gramEnd"/>
+            <w:r>
+              <w:t xml:space="preserve"> activities for each item in a collection</w:t>
             </w:r>
           </w:p>
         </w:tc>
@@ -8233,7 +8668,7 @@
     <w:p>
       <w:r>
         <w:pict w14:anchorId="5A3CB32E">
-          <v:rect id="_x0000_i1055" style="width:0;height:1.5pt" o:hralign="center" o:hrstd="t" o:hr="t" fillcolor="#a0a0a0" stroked="f"/>
+          <v:rect id="_x0000_i1056" style="width:0;height:1.5pt" o:hralign="center" o:hrstd="t" o:hr="t" fillcolor="#a0a0a0" stroked="f"/>
         </w:pict>
       </w:r>
     </w:p>
@@ -8530,7 +8965,7 @@
     <w:p>
       <w:r>
         <w:pict w14:anchorId="65B2CDCA">
-          <v:rect id="_x0000_i1056" style="width:0;height:1.5pt" o:hralign="center" o:hrstd="t" o:hr="t" fillcolor="#a0a0a0" stroked="f"/>
+          <v:rect id="_x0000_i1057" style="width:0;height:1.5pt" o:hralign="center" o:hrstd="t" o:hr="t" fillcolor="#a0a0a0" stroked="f"/>
         </w:pict>
       </w:r>
     </w:p>
@@ -8785,7 +9220,7 @@
     <w:p>
       <w:r>
         <w:pict w14:anchorId="178DB5AC">
-          <v:rect id="_x0000_i1057" style="width:0;height:1.5pt" o:hralign="center" o:hrstd="t" o:hr="t" fillcolor="#a0a0a0" stroked="f"/>
+          <v:rect id="_x0000_i1058" style="width:0;height:1.5pt" o:hralign="center" o:hrstd="t" o:hr="t" fillcolor="#a0a0a0" stroked="f"/>
         </w:pict>
       </w:r>
     </w:p>
@@ -9048,7 +9483,7 @@
     <w:p>
       <w:r>
         <w:pict w14:anchorId="48D04D0A">
-          <v:rect id="_x0000_i1058" style="width:0;height:1.5pt" o:hralign="center" o:hrstd="t" o:hr="t" fillcolor="#a0a0a0" stroked="f"/>
+          <v:rect id="_x0000_i1059" style="width:0;height:1.5pt" o:hralign="center" o:hrstd="t" o:hr="t" fillcolor="#a0a0a0" stroked="f"/>
         </w:pict>
       </w:r>
     </w:p>
@@ -9129,7 +9564,7 @@
     <w:p>
       <w:r>
         <w:pict w14:anchorId="7A284D26">
-          <v:rect id="_x0000_i1059" style="width:0;height:1.5pt" o:hralign="center" o:hrstd="t" o:hr="t" fillcolor="#a0a0a0" stroked="f"/>
+          <v:rect id="_x0000_i1060" style="width:0;height:1.5pt" o:hralign="center" o:hrstd="t" o:hr="t" fillcolor="#a0a0a0" stroked="f"/>
         </w:pict>
       </w:r>
     </w:p>
@@ -9307,7 +9742,7 @@
     <w:p>
       <w:r>
         <w:pict w14:anchorId="7724A6CF">
-          <v:rect id="_x0000_i1060" style="width:0;height:1.5pt" o:hralign="center" o:hrstd="t" o:hr="t" fillcolor="#a0a0a0" stroked="f"/>
+          <v:rect id="_x0000_i1061" style="width:0;height:1.5pt" o:hralign="center" o:hrstd="t" o:hr="t" fillcolor="#a0a0a0" stroked="f"/>
         </w:pict>
       </w:r>
     </w:p>
@@ -9528,7 +9963,7 @@
     <w:p>
       <w:r>
         <w:pict w14:anchorId="542044B7">
-          <v:rect id="_x0000_i1061" style="width:0;height:1.5pt" o:hralign="center" o:hrstd="t" o:hr="t" fillcolor="#a0a0a0" stroked="f"/>
+          <v:rect id="_x0000_i1062" style="width:0;height:1.5pt" o:hralign="center" o:hrstd="t" o:hr="t" fillcolor="#a0a0a0" stroked="f"/>
         </w:pict>
       </w:r>
     </w:p>
@@ -9682,7 +10117,15 @@
           </w:tcPr>
           <w:p>
             <w:r>
-              <w:t>Filter rows based on a condition.</w:t>
+              <w:t xml:space="preserve">Filter rows </w:t>
+            </w:r>
+            <w:proofErr w:type="gramStart"/>
+            <w:r>
+              <w:t>based</w:t>
+            </w:r>
+            <w:proofErr w:type="gramEnd"/>
+            <w:r>
+              <w:t xml:space="preserve"> on a condition.</w:t>
             </w:r>
           </w:p>
         </w:tc>
@@ -10022,7 +10465,7 @@
     <w:p>
       <w:r>
         <w:pict w14:anchorId="74F90182">
-          <v:rect id="_x0000_i1062" style="width:0;height:1.5pt" o:hralign="center" o:hrstd="t" o:hr="t" fillcolor="#a0a0a0" stroked="f"/>
+          <v:rect id="_x0000_i1063" style="width:0;height:1.5pt" o:hralign="center" o:hrstd="t" o:hr="t" fillcolor="#a0a0a0" stroked="f"/>
         </w:pict>
       </w:r>
     </w:p>
@@ -10143,6 +10586,7 @@
       <w:r>
         <w:t xml:space="preserve"> Aggregate total sales by </w:t>
       </w:r>
+      <w:proofErr w:type="gramStart"/>
       <w:r>
         <w:rPr>
           <w:b/>
@@ -10150,6 +10594,7 @@
         </w:rPr>
         <w:t>Region</w:t>
       </w:r>
+      <w:proofErr w:type="gramEnd"/>
       <w:r>
         <w:t xml:space="preserve"> </w:t>
       </w:r>
@@ -10182,7 +10627,7 @@
     <w:p>
       <w:r>
         <w:pict w14:anchorId="0FBBE10D">
-          <v:rect id="_x0000_i1063" style="width:0;height:1.5pt" o:hralign="center" o:hrstd="t" o:hr="t" fillcolor="#a0a0a0" stroked="f"/>
+          <v:rect id="_x0000_i1064" style="width:0;height:1.5pt" o:hralign="center" o:hrstd="t" o:hr="t" fillcolor="#a0a0a0" stroked="f"/>
         </w:pict>
       </w:r>
     </w:p>
@@ -10349,7 +10794,7 @@
     <w:p>
       <w:r>
         <w:pict w14:anchorId="35B556E9">
-          <v:rect id="_x0000_i1064" style="width:0;height:1.5pt" o:hralign="center" o:hrstd="t" o:hr="t" fillcolor="#a0a0a0" stroked="f"/>
+          <v:rect id="_x0000_i1065" style="width:0;height:1.5pt" o:hralign="center" o:hrstd="t" o:hr="t" fillcolor="#a0a0a0" stroked="f"/>
         </w:pict>
       </w:r>
     </w:p>
@@ -10711,7 +11156,7 @@
     <w:p>
       <w:r>
         <w:pict w14:anchorId="08D4026A">
-          <v:rect id="_x0000_i1065" style="width:0;height:1.5pt" o:hralign="center" o:hrstd="t" o:hr="t" fillcolor="#a0a0a0" stroked="f"/>
+          <v:rect id="_x0000_i1066" style="width:0;height:1.5pt" o:hralign="center" o:hrstd="t" o:hr="t" fillcolor="#a0a0a0" stroked="f"/>
         </w:pict>
       </w:r>
     </w:p>
@@ -10872,7 +11317,7 @@
     <w:p>
       <w:r>
         <w:pict w14:anchorId="486D40D9">
-          <v:rect id="_x0000_i1066" style="width:0;height:1.5pt" o:hralign="center" o:hrstd="t" o:hr="t" fillcolor="#a0a0a0" stroked="f"/>
+          <v:rect id="_x0000_i1067" style="width:0;height:1.5pt" o:hralign="center" o:hrstd="t" o:hr="t" fillcolor="#a0a0a0" stroked="f"/>
         </w:pict>
       </w:r>
     </w:p>
@@ -11130,7 +11575,7 @@
     <w:p>
       <w:r>
         <w:pict w14:anchorId="225DA258">
-          <v:rect id="_x0000_i1067" style="width:0;height:1.5pt" o:hralign="center" o:hrstd="t" o:hr="t" fillcolor="#a0a0a0" stroked="f"/>
+          <v:rect id="_x0000_i1068" style="width:0;height:1.5pt" o:hralign="center" o:hrstd="t" o:hr="t" fillcolor="#a0a0a0" stroked="f"/>
         </w:pict>
       </w:r>
     </w:p>
@@ -11475,7 +11920,7 @@
     <w:p>
       <w:r>
         <w:pict w14:anchorId="7D29D7D1">
-          <v:rect id="_x0000_i1068" style="width:0;height:1.5pt" o:hralign="center" o:hrstd="t" o:hr="t" fillcolor="#a0a0a0" stroked="f"/>
+          <v:rect id="_x0000_i1069" style="width:0;height:1.5pt" o:hralign="center" o:hrstd="t" o:hr="t" fillcolor="#a0a0a0" stroked="f"/>
         </w:pict>
       </w:r>
     </w:p>
@@ -11604,7 +12049,7 @@
     <w:p>
       <w:r>
         <w:pict w14:anchorId="49496290">
-          <v:rect id="_x0000_i1069" style="width:0;height:1.5pt" o:hralign="center" o:hrstd="t" o:hr="t" fillcolor="#a0a0a0" stroked="f"/>
+          <v:rect id="_x0000_i1070" style="width:0;height:1.5pt" o:hralign="center" o:hrstd="t" o:hr="t" fillcolor="#a0a0a0" stroked="f"/>
         </w:pict>
       </w:r>
     </w:p>
@@ -11727,7 +12172,7 @@
     <w:p>
       <w:r>
         <w:pict w14:anchorId="1F570F0C">
-          <v:rect id="_x0000_i1070" style="width:0;height:1.5pt" o:hralign="center" o:hrstd="t" o:hr="t" fillcolor="#a0a0a0" stroked="f"/>
+          <v:rect id="_x0000_i1071" style="width:0;height:1.5pt" o:hralign="center" o:hrstd="t" o:hr="t" fillcolor="#a0a0a0" stroked="f"/>
         </w:pict>
       </w:r>
     </w:p>
@@ -11847,7 +12292,7 @@
     <w:p>
       <w:r>
         <w:pict w14:anchorId="69E905F1">
-          <v:rect id="_x0000_i1071" style="width:0;height:1.5pt" o:hralign="center" o:hrstd="t" o:hr="t" fillcolor="#a0a0a0" stroked="f"/>
+          <v:rect id="_x0000_i1072" style="width:0;height:1.5pt" o:hralign="center" o:hrstd="t" o:hr="t" fillcolor="#a0a0a0" stroked="f"/>
         </w:pict>
       </w:r>
     </w:p>
@@ -11963,7 +12408,7 @@
     <w:p>
       <w:r>
         <w:pict w14:anchorId="2B95CC70">
-          <v:rect id="_x0000_i1072" style="width:0;height:1.5pt" o:hralign="center" o:hrstd="t" o:hr="t" fillcolor="#a0a0a0" stroked="f"/>
+          <v:rect id="_x0000_i1073" style="width:0;height:1.5pt" o:hralign="center" o:hrstd="t" o:hr="t" fillcolor="#a0a0a0" stroked="f"/>
         </w:pict>
       </w:r>
     </w:p>
@@ -12066,7 +12511,7 @@
     <w:p>
       <w:r>
         <w:pict w14:anchorId="2CD0AF05">
-          <v:rect id="_x0000_i1073" style="width:0;height:1.5pt" o:hralign="center" o:hrstd="t" o:hr="t" fillcolor="#a0a0a0" stroked="f"/>
+          <v:rect id="_x0000_i1074" style="width:0;height:1.5pt" o:hralign="center" o:hrstd="t" o:hr="t" fillcolor="#a0a0a0" stroked="f"/>
         </w:pict>
       </w:r>
     </w:p>
@@ -12203,7 +12648,7 @@
     <w:p>
       <w:r>
         <w:pict w14:anchorId="5CD70D7C">
-          <v:rect id="_x0000_i1074" style="width:0;height:1.5pt" o:hralign="center" o:hrstd="t" o:hr="t" fillcolor="#a0a0a0" stroked="f"/>
+          <v:rect id="_x0000_i1075" style="width:0;height:1.5pt" o:hralign="center" o:hrstd="t" o:hr="t" fillcolor="#a0a0a0" stroked="f"/>
         </w:pict>
       </w:r>
     </w:p>
@@ -12287,7 +12732,7 @@
     <w:p>
       <w:r>
         <w:pict w14:anchorId="412D3081">
-          <v:rect id="_x0000_i1075" style="width:0;height:1.5pt" o:hralign="center" o:hrstd="t" o:hr="t" fillcolor="#a0a0a0" stroked="f"/>
+          <v:rect id="_x0000_i1076" style="width:0;height:1.5pt" o:hralign="center" o:hrstd="t" o:hr="t" fillcolor="#a0a0a0" stroked="f"/>
         </w:pict>
       </w:r>
     </w:p>
@@ -12704,7 +13149,7 @@
     <w:p>
       <w:r>
         <w:pict w14:anchorId="7DAA9243">
-          <v:rect id="_x0000_i1076" style="width:0;height:1.5pt" o:hralign="center" o:hrstd="t" o:hr="t" fillcolor="#a0a0a0" stroked="f"/>
+          <v:rect id="_x0000_i1077" style="width:0;height:1.5pt" o:hralign="center" o:hrstd="t" o:hr="t" fillcolor="#a0a0a0" stroked="f"/>
         </w:pict>
       </w:r>
     </w:p>
@@ -12788,7 +13233,7 @@
     <w:p>
       <w:r>
         <w:pict w14:anchorId="13BA0689">
-          <v:rect id="_x0000_i1077" style="width:0;height:1.5pt" o:hralign="center" o:hrstd="t" o:hr="t" fillcolor="#a0a0a0" stroked="f"/>
+          <v:rect id="_x0000_i1078" style="width:0;height:1.5pt" o:hralign="center" o:hrstd="t" o:hr="t" fillcolor="#a0a0a0" stroked="f"/>
         </w:pict>
       </w:r>
     </w:p>
@@ -12872,91 +13317,6 @@
     <w:p>
       <w:r>
         <w:pict w14:anchorId="6299625A">
-          <v:rect id="_x0000_i1078" style="width:0;height:1.5pt" o:hralign="center" o:hrstd="t" o:hr="t" fillcolor="#a0a0a0" stroked="f"/>
-        </w:pict>
-      </w:r>
-    </w:p>
-    <w:p>
-      <w:pPr>
-        <w:rPr>
-          <w:b/>
-          <w:bCs/>
-        </w:rPr>
-      </w:pPr>
-      <w:r>
-        <w:rPr>
-          <w:rFonts w:ascii="Segoe UI Emoji" w:hAnsi="Segoe UI Emoji" w:cs="Segoe UI Emoji"/>
-          <w:b/>
-          <w:bCs/>
-        </w:rPr>
-        <w:t>💡</w:t>
-      </w:r>
-      <w:r>
-        <w:rPr>
-          <w:b/>
-          <w:bCs/>
-        </w:rPr>
-        <w:t xml:space="preserve"> Best Practices:</w:t>
-      </w:r>
-    </w:p>
-    <w:p>
-      <w:r>
-        <w:rPr>
-          <w:rFonts w:ascii="Segoe UI Emoji" w:hAnsi="Segoe UI Emoji" w:cs="Segoe UI Emoji"/>
-        </w:rPr>
-        <w:t>✔️</w:t>
-      </w:r>
-      <w:r>
-        <w:t xml:space="preserve"> Use </w:t>
-      </w:r>
-      <w:r>
-        <w:rPr>
-          <w:b/>
-          <w:bCs/>
-        </w:rPr>
-        <w:t>Surrogate Key</w:t>
-      </w:r>
-      <w:r>
-        <w:t xml:space="preserve"> only when you need row-level uniqueness.</w:t>
-      </w:r>
-      <w:r>
-        <w:br/>
-      </w:r>
-      <w:r>
-        <w:rPr>
-          <w:rFonts w:ascii="Segoe UI Emoji" w:hAnsi="Segoe UI Emoji" w:cs="Segoe UI Emoji"/>
-        </w:rPr>
-        <w:t>✔️</w:t>
-      </w:r>
-      <w:r>
-        <w:t xml:space="preserve"> Keep the increment value small for better performance.</w:t>
-      </w:r>
-      <w:r>
-        <w:br/>
-      </w:r>
-      <w:r>
-        <w:rPr>
-          <w:rFonts w:ascii="Segoe UI Emoji" w:hAnsi="Segoe UI Emoji" w:cs="Segoe UI Emoji"/>
-        </w:rPr>
-        <w:t>✔️</w:t>
-      </w:r>
-      <w:r>
-        <w:t xml:space="preserve"> Avoid using </w:t>
-      </w:r>
-      <w:r>
-        <w:rPr>
-          <w:b/>
-          <w:bCs/>
-        </w:rPr>
-        <w:t>Surrogate Key</w:t>
-      </w:r>
-      <w:r>
-        <w:t xml:space="preserve"> for large datasets where sorting is not needed.</w:t>
-      </w:r>
-    </w:p>
-    <w:p>
-      <w:r>
-        <w:pict w14:anchorId="315EF375">
           <v:rect id="_x0000_i1079" style="width:0;height:1.5pt" o:hralign="center" o:hrstd="t" o:hr="t" fillcolor="#a0a0a0" stroked="f"/>
         </w:pict>
       </w:r>
@@ -12974,6 +13334,91 @@
           <w:b/>
           <w:bCs/>
         </w:rPr>
+        <w:t>💡</w:t>
+      </w:r>
+      <w:r>
+        <w:rPr>
+          <w:b/>
+          <w:bCs/>
+        </w:rPr>
+        <w:t xml:space="preserve"> Best Practices:</w:t>
+      </w:r>
+    </w:p>
+    <w:p>
+      <w:r>
+        <w:rPr>
+          <w:rFonts w:ascii="Segoe UI Emoji" w:hAnsi="Segoe UI Emoji" w:cs="Segoe UI Emoji"/>
+        </w:rPr>
+        <w:t>✔️</w:t>
+      </w:r>
+      <w:r>
+        <w:t xml:space="preserve"> Use </w:t>
+      </w:r>
+      <w:r>
+        <w:rPr>
+          <w:b/>
+          <w:bCs/>
+        </w:rPr>
+        <w:t>Surrogate Key</w:t>
+      </w:r>
+      <w:r>
+        <w:t xml:space="preserve"> only when you need row-level uniqueness.</w:t>
+      </w:r>
+      <w:r>
+        <w:br/>
+      </w:r>
+      <w:r>
+        <w:rPr>
+          <w:rFonts w:ascii="Segoe UI Emoji" w:hAnsi="Segoe UI Emoji" w:cs="Segoe UI Emoji"/>
+        </w:rPr>
+        <w:t>✔️</w:t>
+      </w:r>
+      <w:r>
+        <w:t xml:space="preserve"> Keep the increment value small for better performance.</w:t>
+      </w:r>
+      <w:r>
+        <w:br/>
+      </w:r>
+      <w:r>
+        <w:rPr>
+          <w:rFonts w:ascii="Segoe UI Emoji" w:hAnsi="Segoe UI Emoji" w:cs="Segoe UI Emoji"/>
+        </w:rPr>
+        <w:t>✔️</w:t>
+      </w:r>
+      <w:r>
+        <w:t xml:space="preserve"> Avoid using </w:t>
+      </w:r>
+      <w:r>
+        <w:rPr>
+          <w:b/>
+          <w:bCs/>
+        </w:rPr>
+        <w:t>Surrogate Key</w:t>
+      </w:r>
+      <w:r>
+        <w:t xml:space="preserve"> for large datasets where sorting is not needed.</w:t>
+      </w:r>
+    </w:p>
+    <w:p>
+      <w:r>
+        <w:pict w14:anchorId="315EF375">
+          <v:rect id="_x0000_i1080" style="width:0;height:1.5pt" o:hralign="center" o:hrstd="t" o:hr="t" fillcolor="#a0a0a0" stroked="f"/>
+        </w:pict>
+      </w:r>
+    </w:p>
+    <w:p>
+      <w:pPr>
+        <w:rPr>
+          <w:b/>
+          <w:bCs/>
+        </w:rPr>
+      </w:pPr>
+      <w:r>
+        <w:rPr>
+          <w:rFonts w:ascii="Segoe UI Emoji" w:hAnsi="Segoe UI Emoji" w:cs="Segoe UI Emoji"/>
+          <w:b/>
+          <w:bCs/>
+        </w:rPr>
         <w:t>🎯</w:t>
       </w:r>
       <w:r>
@@ -13022,7 +13467,7 @@
     <w:p>
       <w:r>
         <w:pict w14:anchorId="22AEA466">
-          <v:rect id="_x0000_i1080" style="width:0;height:1.5pt" o:hralign="center" o:hrstd="t" o:hr="t" fillcolor="#a0a0a0" stroked="f"/>
+          <v:rect id="_x0000_i1081" style="width:0;height:1.5pt" o:hralign="center" o:hrstd="t" o:hr="t" fillcolor="#a0a0a0" stroked="f"/>
         </w:pict>
       </w:r>
     </w:p>
@@ -13067,7 +13512,15 @@
         <w:t xml:space="preserve">                        </w:t>
       </w:r>
       <w:r>
-        <w:t>row_number()</w:t>
+        <w:t>row_</w:t>
+      </w:r>
+      <w:proofErr w:type="gramStart"/>
+      <w:r>
+        <w:t>number(</w:t>
+      </w:r>
+      <w:proofErr w:type="gramEnd"/>
+      <w:r>
+        <w:t>)</w:t>
       </w:r>
     </w:p>
     <w:p>
@@ -13088,7 +13541,7 @@
     <w:p>
       <w:r>
         <w:pict w14:anchorId="20E5AF2E">
-          <v:rect id="_x0000_i1081" style="width:0;height:1.5pt" o:hralign="center" o:hrstd="t" o:hr="t" fillcolor="#a0a0a0" stroked="f"/>
+          <v:rect id="_x0000_i1082" style="width:0;height:1.5pt" o:hralign="center" o:hrstd="t" o:hr="t" fillcolor="#a0a0a0" stroked="f"/>
         </w:pict>
       </w:r>
     </w:p>
@@ -13117,13 +13570,32 @@
     </w:p>
     <w:p>
       <w:r>
-        <w:t>Import pyodbc  pyodbc.connect  using this we can connect database</w:t>
+        <w:t xml:space="preserve">Import </w:t>
+      </w:r>
+      <w:proofErr w:type="gramStart"/>
+      <w:r>
+        <w:t>pyodbc  pyodbc</w:t>
+      </w:r>
+      <w:proofErr w:type="gramEnd"/>
+      <w:r>
+        <w:t>.</w:t>
+      </w:r>
+      <w:proofErr w:type="gramStart"/>
+      <w:r>
+        <w:t>connect  using</w:t>
+      </w:r>
+      <w:proofErr w:type="gramEnd"/>
+      <w:r>
+        <w:t xml:space="preserve"> this we can connect database</w:t>
       </w:r>
     </w:p>
     <w:p/>
     <w:p/>
     <w:p>
       <w:r>
+        <w:rPr>
+          <w:noProof/>
+        </w:rPr>
         <w:lastRenderedPageBreak/>
         <w:drawing>
           <wp:inline distT="0" distB="0" distL="0" distR="0" wp14:anchorId="3C2B66F7" wp14:editId="431DDC87">
@@ -13166,8 +13638,13 @@
     <w:p/>
     <w:p>
       <w:r>
-        <w:t>When to use Synapse rather databricks :</w:t>
-      </w:r>
+        <w:t xml:space="preserve">When to use Synapse rather </w:t>
+      </w:r>
+      <w:proofErr w:type="gramStart"/>
+      <w:r>
+        <w:t>databricks :</w:t>
+      </w:r>
+      <w:proofErr w:type="gramEnd"/>
     </w:p>
     <w:p/>
     <w:p>
@@ -13282,7 +13759,7 @@
     <w:p>
       <w:r>
         <w:pict w14:anchorId="4EF416CC">
-          <v:rect id="_x0000_i1124" style="width:0;height:1.5pt" o:hralign="center" o:hrstd="t" o:hr="t" fillcolor="#a0a0a0" stroked="f"/>
+          <v:rect id="_x0000_i1083" style="width:0;height:1.5pt" o:hralign="center" o:hrstd="t" o:hr="t" fillcolor="#a0a0a0" stroked="f"/>
         </w:pict>
       </w:r>
     </w:p>
@@ -13382,7 +13859,7 @@
       <w:r>
         <w:lastRenderedPageBreak/>
         <w:pict w14:anchorId="051B660E">
-          <v:rect id="_x0000_i1125" style="width:0;height:1.5pt" o:hralign="center" o:hrstd="t" o:hr="t" fillcolor="#a0a0a0" stroked="f"/>
+          <v:rect id="_x0000_i1084" style="width:0;height:1.5pt" o:hralign="center" o:hrstd="t" o:hr="t" fillcolor="#a0a0a0" stroked="f"/>
         </w:pict>
       </w:r>
     </w:p>
@@ -13458,7 +13935,7 @@
     <w:p>
       <w:r>
         <w:pict w14:anchorId="0726E7AE">
-          <v:rect id="_x0000_i1126" style="width:0;height:1.5pt" o:hralign="center" o:hrstd="t" o:hr="t" fillcolor="#a0a0a0" stroked="f"/>
+          <v:rect id="_x0000_i1085" style="width:0;height:1.5pt" o:hralign="center" o:hrstd="t" o:hr="t" fillcolor="#a0a0a0" stroked="f"/>
         </w:pict>
       </w:r>
     </w:p>
@@ -13530,7 +14007,7 @@
     <w:p>
       <w:r>
         <w:pict w14:anchorId="7A92A159">
-          <v:rect id="_x0000_i1127" style="width:0;height:1.5pt" o:hralign="center" o:hrstd="t" o:hr="t" fillcolor="#a0a0a0" stroked="f"/>
+          <v:rect id="_x0000_i1086" style="width:0;height:1.5pt" o:hralign="center" o:hrstd="t" o:hr="t" fillcolor="#a0a0a0" stroked="f"/>
         </w:pict>
       </w:r>
     </w:p>
@@ -13604,7 +14081,7 @@
     <w:p>
       <w:r>
         <w:pict w14:anchorId="6644DACD">
-          <v:rect id="_x0000_i1128" style="width:0;height:1.5pt" o:hralign="center" o:hrstd="t" o:hr="t" fillcolor="#a0a0a0" stroked="f"/>
+          <v:rect id="_x0000_i1087" style="width:0;height:1.5pt" o:hralign="center" o:hrstd="t" o:hr="t" fillcolor="#a0a0a0" stroked="f"/>
         </w:pict>
       </w:r>
     </w:p>
@@ -13677,7 +14154,7 @@
     <w:p>
       <w:r>
         <w:pict w14:anchorId="7A8AD3E5">
-          <v:rect id="_x0000_i1129" style="width:0;height:1.5pt" o:hralign="center" o:hrstd="t" o:hr="t" fillcolor="#a0a0a0" stroked="f"/>
+          <v:rect id="_x0000_i1088" style="width:0;height:1.5pt" o:hralign="center" o:hrstd="t" o:hr="t" fillcolor="#a0a0a0" stroked="f"/>
         </w:pict>
       </w:r>
     </w:p>
@@ -13771,8 +14248,13 @@
         </w:numPr>
       </w:pPr>
       <w:r>
-        <w:t>Performance tuning, Z-Ordering, advanced caching</w:t>
-      </w:r>
+        <w:t xml:space="preserve">Performance tuning, Z-Ordering, advanced </w:t>
+      </w:r>
+      <w:proofErr w:type="gramStart"/>
+      <w:r>
+        <w:t>caching</w:t>
+      </w:r>
+      <w:proofErr w:type="gramEnd"/>
     </w:p>
     <w:p>
       <w:pPr>
@@ -13810,7 +14292,7 @@
     <w:p>
       <w:r>
         <w:pict w14:anchorId="3AEFE7D6">
-          <v:rect id="_x0000_i1130" style="width:0;height:1.5pt" o:hralign="center" o:hrstd="t" o:hr="t" fillcolor="#a0a0a0" stroked="f"/>
+          <v:rect id="_x0000_i1089" style="width:0;height:1.5pt" o:hralign="center" o:hrstd="t" o:hr="t" fillcolor="#a0a0a0" stroked="f"/>
         </w:pict>
       </w:r>
     </w:p>
@@ -14306,6 +14788,1237 @@
         </w:tc>
       </w:tr>
     </w:tbl>
+    <w:p>
+      <w:pPr>
+        <w:pBdr>
+          <w:bottom w:val="double" w:sz="6" w:space="1" w:color="auto"/>
+        </w:pBdr>
+      </w:pPr>
+    </w:p>
+    <w:p/>
+    <w:p/>
+    <w:p>
+      <w:r>
+        <w:lastRenderedPageBreak/>
+        <w:t xml:space="preserve">Defining the </w:t>
+      </w:r>
+      <w:r>
+        <w:rPr>
+          <w:b/>
+          <w:bCs/>
+        </w:rPr>
+        <w:t>Dedicated SQL Pool size</w:t>
+      </w:r>
+      <w:r>
+        <w:t xml:space="preserve"> in </w:t>
+      </w:r>
+      <w:r>
+        <w:rPr>
+          <w:b/>
+          <w:bCs/>
+        </w:rPr>
+        <w:t>Azure Synapse Analytics</w:t>
+      </w:r>
+      <w:r>
+        <w:t xml:space="preserve"> depends on your </w:t>
+      </w:r>
+      <w:r>
+        <w:rPr>
+          <w:b/>
+          <w:bCs/>
+        </w:rPr>
+        <w:t>data size</w:t>
+      </w:r>
+      <w:r>
+        <w:t xml:space="preserve">, </w:t>
+      </w:r>
+      <w:r>
+        <w:rPr>
+          <w:b/>
+          <w:bCs/>
+        </w:rPr>
+        <w:t>concurrency needs</w:t>
+      </w:r>
+      <w:r>
+        <w:t xml:space="preserve">, and </w:t>
+      </w:r>
+      <w:r>
+        <w:rPr>
+          <w:b/>
+          <w:bCs/>
+        </w:rPr>
+        <w:t>performance goals</w:t>
+      </w:r>
+      <w:r>
+        <w:t xml:space="preserve">. In Azure Synapse, the size of a dedicated SQL pool is defined using </w:t>
+      </w:r>
+      <w:r>
+        <w:rPr>
+          <w:b/>
+          <w:bCs/>
+        </w:rPr>
+        <w:t>Data Warehousing Units (DWUs)</w:t>
+      </w:r>
+      <w:r>
+        <w:t>.</w:t>
+      </w:r>
+    </w:p>
+    <w:p>
+      <w:r>
+        <w:pict w14:anchorId="1C7F7B5E">
+          <v:rect id="_x0000_i1132" style="width:0;height:1.5pt" o:hralign="center" o:hrstd="t" o:hr="t" fillcolor="#a0a0a0" stroked="f"/>
+        </w:pict>
+      </w:r>
+    </w:p>
+    <w:p>
+      <w:pPr>
+        <w:rPr>
+          <w:b/>
+          <w:bCs/>
+        </w:rPr>
+      </w:pPr>
+      <w:r>
+        <w:rPr>
+          <w:rFonts w:ascii="Segoe UI Emoji" w:hAnsi="Segoe UI Emoji" w:cs="Segoe UI Emoji"/>
+          <w:b/>
+          <w:bCs/>
+        </w:rPr>
+        <w:t>✅</w:t>
+      </w:r>
+      <w:r>
+        <w:rPr>
+          <w:b/>
+          <w:bCs/>
+        </w:rPr>
+        <w:t xml:space="preserve"> What Is a DWU?</w:t>
+      </w:r>
+    </w:p>
+    <w:p>
+      <w:r>
+        <w:t xml:space="preserve">A </w:t>
+      </w:r>
+      <w:r>
+        <w:rPr>
+          <w:b/>
+          <w:bCs/>
+        </w:rPr>
+        <w:t>DWU (Data Warehouse Unit)</w:t>
+      </w:r>
+      <w:r>
+        <w:t xml:space="preserve"> is a </w:t>
+      </w:r>
+      <w:r>
+        <w:rPr>
+          <w:b/>
+          <w:bCs/>
+        </w:rPr>
+        <w:t>bundle of CPU, memory, and I/O</w:t>
+      </w:r>
+      <w:r>
+        <w:t xml:space="preserve"> resources. More DWUs = more compute power = faster processing (and higher cost).</w:t>
+      </w:r>
+    </w:p>
+    <w:p>
+      <w:r>
+        <w:pict w14:anchorId="61AC8330">
+          <v:rect id="_x0000_i1133" style="width:0;height:1.5pt" o:hralign="center" o:hrstd="t" o:hr="t" fillcolor="#a0a0a0" stroked="f"/>
+        </w:pict>
+      </w:r>
+    </w:p>
+    <w:p>
+      <w:pPr>
+        <w:rPr>
+          <w:b/>
+          <w:bCs/>
+        </w:rPr>
+      </w:pPr>
+      <w:r>
+        <w:rPr>
+          <w:rFonts w:ascii="Segoe UI Emoji" w:hAnsi="Segoe UI Emoji" w:cs="Segoe UI Emoji"/>
+          <w:b/>
+          <w:bCs/>
+        </w:rPr>
+        <w:t>📌</w:t>
+      </w:r>
+      <w:r>
+        <w:rPr>
+          <w:b/>
+          <w:bCs/>
+        </w:rPr>
+        <w:t xml:space="preserve"> How to Choose/Define Dedicated Pool Size (DWU Level)</w:t>
+      </w:r>
+    </w:p>
+    <w:tbl>
+      <w:tblPr>
+        <w:tblW w:w="0" w:type="auto"/>
+        <w:tblCellSpacing w:w="15" w:type="dxa"/>
+        <w:tblCellMar>
+          <w:top w:w="15" w:type="dxa"/>
+          <w:left w:w="15" w:type="dxa"/>
+          <w:bottom w:w="15" w:type="dxa"/>
+          <w:right w:w="15" w:type="dxa"/>
+        </w:tblCellMar>
+        <w:tblLook w:val="04A0" w:firstRow="1" w:lastRow="0" w:firstColumn="1" w:lastColumn="0" w:noHBand="0" w:noVBand="1"/>
+      </w:tblPr>
+      <w:tblGrid>
+        <w:gridCol w:w="2061"/>
+        <w:gridCol w:w="3654"/>
+        <w:gridCol w:w="2621"/>
+        <w:gridCol w:w="1024"/>
+      </w:tblGrid>
+      <w:tr>
+        <w:trPr>
+          <w:tblHeader/>
+          <w:tblCellSpacing w:w="15" w:type="dxa"/>
+        </w:trPr>
+        <w:tc>
+          <w:tcPr>
+            <w:tcW w:w="0" w:type="auto"/>
+            <w:vAlign w:val="center"/>
+            <w:hideMark/>
+          </w:tcPr>
+          <w:p>
+            <w:pPr>
+              <w:rPr>
+                <w:b/>
+                <w:bCs/>
+              </w:rPr>
+            </w:pPr>
+            <w:r>
+              <w:rPr>
+                <w:b/>
+                <w:bCs/>
+              </w:rPr>
+              <w:t>DWU Level</w:t>
+            </w:r>
+          </w:p>
+        </w:tc>
+        <w:tc>
+          <w:tcPr>
+            <w:tcW w:w="0" w:type="auto"/>
+            <w:vAlign w:val="center"/>
+            <w:hideMark/>
+          </w:tcPr>
+          <w:p>
+            <w:pPr>
+              <w:rPr>
+                <w:b/>
+                <w:bCs/>
+              </w:rPr>
+            </w:pPr>
+            <w:r>
+              <w:rPr>
+                <w:b/>
+                <w:bCs/>
+              </w:rPr>
+              <w:t>Use Case</w:t>
+            </w:r>
+          </w:p>
+        </w:tc>
+        <w:tc>
+          <w:tcPr>
+            <w:tcW w:w="0" w:type="auto"/>
+            <w:vAlign w:val="center"/>
+            <w:hideMark/>
+          </w:tcPr>
+          <w:p>
+            <w:pPr>
+              <w:rPr>
+                <w:b/>
+                <w:bCs/>
+              </w:rPr>
+            </w:pPr>
+            <w:r>
+              <w:rPr>
+                <w:b/>
+                <w:bCs/>
+              </w:rPr>
+              <w:t>Max Concurrent Queries</w:t>
+            </w:r>
+          </w:p>
+        </w:tc>
+        <w:tc>
+          <w:tcPr>
+            <w:tcW w:w="0" w:type="auto"/>
+            <w:vAlign w:val="center"/>
+            <w:hideMark/>
+          </w:tcPr>
+          <w:p>
+            <w:pPr>
+              <w:rPr>
+                <w:b/>
+                <w:bCs/>
+              </w:rPr>
+            </w:pPr>
+            <w:r>
+              <w:rPr>
+                <w:b/>
+                <w:bCs/>
+              </w:rPr>
+              <w:t>Storage*</w:t>
+            </w:r>
+          </w:p>
+        </w:tc>
+      </w:tr>
+      <w:tr>
+        <w:trPr>
+          <w:tblCellSpacing w:w="15" w:type="dxa"/>
+        </w:trPr>
+        <w:tc>
+          <w:tcPr>
+            <w:tcW w:w="0" w:type="auto"/>
+            <w:vAlign w:val="center"/>
+            <w:hideMark/>
+          </w:tcPr>
+          <w:p>
+            <w:r>
+              <w:rPr>
+                <w:b/>
+                <w:bCs/>
+              </w:rPr>
+              <w:t>DW100</w:t>
+            </w:r>
+          </w:p>
+        </w:tc>
+        <w:tc>
+          <w:tcPr>
+            <w:tcW w:w="0" w:type="auto"/>
+            <w:vAlign w:val="center"/>
+            <w:hideMark/>
+          </w:tcPr>
+          <w:p>
+            <w:r>
+              <w:t>Dev/Test, small datasets</w:t>
+            </w:r>
+          </w:p>
+        </w:tc>
+        <w:tc>
+          <w:tcPr>
+            <w:tcW w:w="0" w:type="auto"/>
+            <w:vAlign w:val="center"/>
+            <w:hideMark/>
+          </w:tcPr>
+          <w:p>
+            <w:r>
+              <w:t>~4</w:t>
+            </w:r>
+          </w:p>
+        </w:tc>
+        <w:tc>
+          <w:tcPr>
+            <w:tcW w:w="0" w:type="auto"/>
+            <w:vAlign w:val="center"/>
+            <w:hideMark/>
+          </w:tcPr>
+          <w:p>
+            <w:r>
+              <w:t>~1 TB</w:t>
+            </w:r>
+          </w:p>
+        </w:tc>
+      </w:tr>
+      <w:tr>
+        <w:trPr>
+          <w:tblCellSpacing w:w="15" w:type="dxa"/>
+        </w:trPr>
+        <w:tc>
+          <w:tcPr>
+            <w:tcW w:w="0" w:type="auto"/>
+            <w:vAlign w:val="center"/>
+            <w:hideMark/>
+          </w:tcPr>
+          <w:p>
+            <w:r>
+              <w:rPr>
+                <w:b/>
+                <w:bCs/>
+              </w:rPr>
+              <w:t>DW200–DW400</w:t>
+            </w:r>
+          </w:p>
+        </w:tc>
+        <w:tc>
+          <w:tcPr>
+            <w:tcW w:w="0" w:type="auto"/>
+            <w:vAlign w:val="center"/>
+            <w:hideMark/>
+          </w:tcPr>
+          <w:p>
+            <w:r>
+              <w:t>Small production workloads</w:t>
+            </w:r>
+          </w:p>
+        </w:tc>
+        <w:tc>
+          <w:tcPr>
+            <w:tcW w:w="0" w:type="auto"/>
+            <w:vAlign w:val="center"/>
+            <w:hideMark/>
+          </w:tcPr>
+          <w:p>
+            <w:r>
+              <w:t>~8–16</w:t>
+            </w:r>
+          </w:p>
+        </w:tc>
+        <w:tc>
+          <w:tcPr>
+            <w:tcW w:w="0" w:type="auto"/>
+            <w:vAlign w:val="center"/>
+            <w:hideMark/>
+          </w:tcPr>
+          <w:p>
+            <w:r>
+              <w:t>~2–5 TB</w:t>
+            </w:r>
+          </w:p>
+        </w:tc>
+      </w:tr>
+      <w:tr>
+        <w:trPr>
+          <w:tblCellSpacing w:w="15" w:type="dxa"/>
+        </w:trPr>
+        <w:tc>
+          <w:tcPr>
+            <w:tcW w:w="0" w:type="auto"/>
+            <w:vAlign w:val="center"/>
+            <w:hideMark/>
+          </w:tcPr>
+          <w:p>
+            <w:r>
+              <w:rPr>
+                <w:b/>
+                <w:bCs/>
+              </w:rPr>
+              <w:t>DW1000</w:t>
+            </w:r>
+          </w:p>
+        </w:tc>
+        <w:tc>
+          <w:tcPr>
+            <w:tcW w:w="0" w:type="auto"/>
+            <w:vAlign w:val="center"/>
+            <w:hideMark/>
+          </w:tcPr>
+          <w:p>
+            <w:r>
+              <w:t>Mid-size production, faster queries</w:t>
+            </w:r>
+          </w:p>
+        </w:tc>
+        <w:tc>
+          <w:tcPr>
+            <w:tcW w:w="0" w:type="auto"/>
+            <w:vAlign w:val="center"/>
+            <w:hideMark/>
+          </w:tcPr>
+          <w:p>
+            <w:r>
+              <w:t>~32</w:t>
+            </w:r>
+          </w:p>
+        </w:tc>
+        <w:tc>
+          <w:tcPr>
+            <w:tcW w:w="0" w:type="auto"/>
+            <w:vAlign w:val="center"/>
+            <w:hideMark/>
+          </w:tcPr>
+          <w:p>
+            <w:r>
+              <w:t>~10+ TB</w:t>
+            </w:r>
+          </w:p>
+        </w:tc>
+      </w:tr>
+      <w:tr>
+        <w:trPr>
+          <w:tblCellSpacing w:w="15" w:type="dxa"/>
+        </w:trPr>
+        <w:tc>
+          <w:tcPr>
+            <w:tcW w:w="0" w:type="auto"/>
+            <w:vAlign w:val="center"/>
+            <w:hideMark/>
+          </w:tcPr>
+          <w:p>
+            <w:r>
+              <w:rPr>
+                <w:b/>
+                <w:bCs/>
+              </w:rPr>
+              <w:t>DW2000–DW3000</w:t>
+            </w:r>
+          </w:p>
+        </w:tc>
+        <w:tc>
+          <w:tcPr>
+            <w:tcW w:w="0" w:type="auto"/>
+            <w:vAlign w:val="center"/>
+            <w:hideMark/>
+          </w:tcPr>
+          <w:p>
+            <w:r>
+              <w:t>High concurrency and large volumes</w:t>
+            </w:r>
+          </w:p>
+        </w:tc>
+        <w:tc>
+          <w:tcPr>
+            <w:tcW w:w="0" w:type="auto"/>
+            <w:vAlign w:val="center"/>
+            <w:hideMark/>
+          </w:tcPr>
+          <w:p>
+            <w:r>
+              <w:t>~64+</w:t>
+            </w:r>
+          </w:p>
+        </w:tc>
+        <w:tc>
+          <w:tcPr>
+            <w:tcW w:w="0" w:type="auto"/>
+            <w:vAlign w:val="center"/>
+            <w:hideMark/>
+          </w:tcPr>
+          <w:p>
+            <w:r>
+              <w:t>~30+ TB</w:t>
+            </w:r>
+          </w:p>
+        </w:tc>
+      </w:tr>
+      <w:tr>
+        <w:trPr>
+          <w:tblCellSpacing w:w="15" w:type="dxa"/>
+        </w:trPr>
+        <w:tc>
+          <w:tcPr>
+            <w:tcW w:w="0" w:type="auto"/>
+            <w:vAlign w:val="center"/>
+            <w:hideMark/>
+          </w:tcPr>
+          <w:p>
+            <w:r>
+              <w:rPr>
+                <w:b/>
+                <w:bCs/>
+              </w:rPr>
+              <w:t>DW6000–DW30000</w:t>
+            </w:r>
+          </w:p>
+        </w:tc>
+        <w:tc>
+          <w:tcPr>
+            <w:tcW w:w="0" w:type="auto"/>
+            <w:vAlign w:val="center"/>
+            <w:hideMark/>
+          </w:tcPr>
+          <w:p>
+            <w:r>
+              <w:t>Enterprise-level</w:t>
+            </w:r>
+          </w:p>
+        </w:tc>
+        <w:tc>
+          <w:tcPr>
+            <w:tcW w:w="0" w:type="auto"/>
+            <w:vAlign w:val="center"/>
+            <w:hideMark/>
+          </w:tcPr>
+          <w:p>
+            <w:r>
+              <w:t>Up to 128+</w:t>
+            </w:r>
+          </w:p>
+        </w:tc>
+        <w:tc>
+          <w:tcPr>
+            <w:tcW w:w="0" w:type="auto"/>
+            <w:vAlign w:val="center"/>
+            <w:hideMark/>
+          </w:tcPr>
+          <w:p>
+            <w:r>
+              <w:t>~100+ TB</w:t>
+            </w:r>
+          </w:p>
+        </w:tc>
+      </w:tr>
+    </w:tbl>
+    <w:p>
+      <w:r>
+        <w:rPr>
+          <w:rFonts w:ascii="Segoe UI Emoji" w:hAnsi="Segoe UI Emoji" w:cs="Segoe UI Emoji"/>
+        </w:rPr>
+        <w:t>📝</w:t>
+      </w:r>
+      <w:r>
+        <w:t xml:space="preserve"> *Storage can scale automatically, but performance depends on DWU.</w:t>
+      </w:r>
+    </w:p>
+    <w:p>
+      <w:r>
+        <w:pict w14:anchorId="3231B190">
+          <v:rect id="_x0000_i1134" style="width:0;height:1.5pt" o:hralign="center" o:hrstd="t" o:hr="t" fillcolor="#a0a0a0" stroked="f"/>
+        </w:pict>
+      </w:r>
+    </w:p>
+    <w:p>
+      <w:pPr>
+        <w:rPr>
+          <w:b/>
+          <w:bCs/>
+        </w:rPr>
+      </w:pPr>
+      <w:r>
+        <w:rPr>
+          <w:rFonts w:ascii="Segoe UI Emoji" w:hAnsi="Segoe UI Emoji" w:cs="Segoe UI Emoji"/>
+          <w:b/>
+          <w:bCs/>
+        </w:rPr>
+        <w:t>🛠️</w:t>
+      </w:r>
+      <w:r>
+        <w:rPr>
+          <w:b/>
+          <w:bCs/>
+        </w:rPr>
+        <w:t xml:space="preserve"> Steps to Define/Set Pool Size in Portal</w:t>
+      </w:r>
+    </w:p>
+    <w:p>
+      <w:pPr>
+        <w:numPr>
+          <w:ilvl w:val="0"/>
+          <w:numId w:val="69"/>
+        </w:numPr>
+      </w:pPr>
+      <w:r>
+        <w:t xml:space="preserve">Go to </w:t>
+      </w:r>
+      <w:r>
+        <w:rPr>
+          <w:b/>
+          <w:bCs/>
+        </w:rPr>
+        <w:t>Azure Portal</w:t>
+      </w:r>
+    </w:p>
+    <w:p>
+      <w:pPr>
+        <w:numPr>
+          <w:ilvl w:val="0"/>
+          <w:numId w:val="69"/>
+        </w:numPr>
+      </w:pPr>
+      <w:r>
+        <w:t xml:space="preserve">Navigate to your </w:t>
+      </w:r>
+      <w:r>
+        <w:rPr>
+          <w:b/>
+          <w:bCs/>
+        </w:rPr>
+        <w:t>Synapse workspace</w:t>
+      </w:r>
+    </w:p>
+    <w:p>
+      <w:pPr>
+        <w:numPr>
+          <w:ilvl w:val="0"/>
+          <w:numId w:val="69"/>
+        </w:numPr>
+      </w:pPr>
+      <w:r>
+        <w:t xml:space="preserve">Go to </w:t>
+      </w:r>
+      <w:r>
+        <w:rPr>
+          <w:b/>
+          <w:bCs/>
+        </w:rPr>
+        <w:t>SQL Dedicated Pools</w:t>
+      </w:r>
+    </w:p>
+    <w:p>
+      <w:pPr>
+        <w:numPr>
+          <w:ilvl w:val="0"/>
+          <w:numId w:val="69"/>
+        </w:numPr>
+      </w:pPr>
+      <w:r>
+        <w:t>Create or edit an existing pool</w:t>
+      </w:r>
+    </w:p>
+    <w:p>
+      <w:pPr>
+        <w:numPr>
+          <w:ilvl w:val="0"/>
+          <w:numId w:val="69"/>
+        </w:numPr>
+      </w:pPr>
+      <w:r>
+        <w:t xml:space="preserve">Choose the </w:t>
+      </w:r>
+      <w:r>
+        <w:rPr>
+          <w:b/>
+          <w:bCs/>
+        </w:rPr>
+        <w:t>Performance Level (DWU)</w:t>
+      </w:r>
+      <w:r>
+        <w:t xml:space="preserve"> from dropdown</w:t>
+      </w:r>
+    </w:p>
+    <w:p>
+      <w:r>
+        <w:pict w14:anchorId="3775B515">
+          <v:rect id="_x0000_i1135" style="width:0;height:1.5pt" o:hralign="center" o:hrstd="t" o:hr="t" fillcolor="#a0a0a0" stroked="f"/>
+        </w:pict>
+      </w:r>
+    </w:p>
+    <w:p>
+      <w:pPr>
+        <w:rPr>
+          <w:b/>
+          <w:bCs/>
+        </w:rPr>
+      </w:pPr>
+      <w:r>
+        <w:rPr>
+          <w:rFonts w:ascii="Segoe UI Emoji" w:hAnsi="Segoe UI Emoji" w:cs="Segoe UI Emoji"/>
+          <w:b/>
+          <w:bCs/>
+        </w:rPr>
+        <w:lastRenderedPageBreak/>
+        <w:t>⚙️</w:t>
+      </w:r>
+      <w:r>
+        <w:rPr>
+          <w:b/>
+          <w:bCs/>
+        </w:rPr>
+        <w:t xml:space="preserve"> Considerations for Sizing</w:t>
+      </w:r>
+    </w:p>
+    <w:tbl>
+      <w:tblPr>
+        <w:tblW w:w="0" w:type="auto"/>
+        <w:tblCellSpacing w:w="15" w:type="dxa"/>
+        <w:tblCellMar>
+          <w:top w:w="15" w:type="dxa"/>
+          <w:left w:w="15" w:type="dxa"/>
+          <w:bottom w:w="15" w:type="dxa"/>
+          <w:right w:w="15" w:type="dxa"/>
+        </w:tblCellMar>
+        <w:tblLook w:val="04A0" w:firstRow="1" w:lastRow="0" w:firstColumn="1" w:lastColumn="0" w:noHBand="0" w:noVBand="1"/>
+      </w:tblPr>
+      <w:tblGrid>
+        <w:gridCol w:w="2197"/>
+        <w:gridCol w:w="5986"/>
+      </w:tblGrid>
+      <w:tr>
+        <w:trPr>
+          <w:tblHeader/>
+          <w:tblCellSpacing w:w="15" w:type="dxa"/>
+        </w:trPr>
+        <w:tc>
+          <w:tcPr>
+            <w:tcW w:w="0" w:type="auto"/>
+            <w:vAlign w:val="center"/>
+            <w:hideMark/>
+          </w:tcPr>
+          <w:p>
+            <w:pPr>
+              <w:rPr>
+                <w:b/>
+                <w:bCs/>
+              </w:rPr>
+            </w:pPr>
+            <w:r>
+              <w:rPr>
+                <w:b/>
+                <w:bCs/>
+              </w:rPr>
+              <w:t>Factor</w:t>
+            </w:r>
+          </w:p>
+        </w:tc>
+        <w:tc>
+          <w:tcPr>
+            <w:tcW w:w="0" w:type="auto"/>
+            <w:vAlign w:val="center"/>
+            <w:hideMark/>
+          </w:tcPr>
+          <w:p>
+            <w:pPr>
+              <w:rPr>
+                <w:b/>
+                <w:bCs/>
+              </w:rPr>
+            </w:pPr>
+            <w:r>
+              <w:rPr>
+                <w:b/>
+                <w:bCs/>
+              </w:rPr>
+              <w:t>Consideration</w:t>
+            </w:r>
+          </w:p>
+        </w:tc>
+      </w:tr>
+      <w:tr>
+        <w:trPr>
+          <w:tblCellSpacing w:w="15" w:type="dxa"/>
+        </w:trPr>
+        <w:tc>
+          <w:tcPr>
+            <w:tcW w:w="0" w:type="auto"/>
+            <w:vAlign w:val="center"/>
+            <w:hideMark/>
+          </w:tcPr>
+          <w:p>
+            <w:r>
+              <w:rPr>
+                <w:b/>
+                <w:bCs/>
+              </w:rPr>
+              <w:t>Data Volume</w:t>
+            </w:r>
+          </w:p>
+        </w:tc>
+        <w:tc>
+          <w:tcPr>
+            <w:tcW w:w="0" w:type="auto"/>
+            <w:vAlign w:val="center"/>
+            <w:hideMark/>
+          </w:tcPr>
+          <w:p>
+            <w:r>
+              <w:t>1 TB of data → DW400 or more</w:t>
+            </w:r>
+          </w:p>
+        </w:tc>
+      </w:tr>
+      <w:tr>
+        <w:trPr>
+          <w:tblCellSpacing w:w="15" w:type="dxa"/>
+        </w:trPr>
+        <w:tc>
+          <w:tcPr>
+            <w:tcW w:w="0" w:type="auto"/>
+            <w:vAlign w:val="center"/>
+            <w:hideMark/>
+          </w:tcPr>
+          <w:p>
+            <w:r>
+              <w:rPr>
+                <w:b/>
+                <w:bCs/>
+              </w:rPr>
+              <w:t>Query Concurrency</w:t>
+            </w:r>
+          </w:p>
+        </w:tc>
+        <w:tc>
+          <w:tcPr>
+            <w:tcW w:w="0" w:type="auto"/>
+            <w:vAlign w:val="center"/>
+            <w:hideMark/>
+          </w:tcPr>
+          <w:p>
+            <w:r>
+              <w:t>More concurrent users → higher DWUs</w:t>
+            </w:r>
+          </w:p>
+        </w:tc>
+      </w:tr>
+      <w:tr>
+        <w:trPr>
+          <w:tblCellSpacing w:w="15" w:type="dxa"/>
+        </w:trPr>
+        <w:tc>
+          <w:tcPr>
+            <w:tcW w:w="0" w:type="auto"/>
+            <w:vAlign w:val="center"/>
+            <w:hideMark/>
+          </w:tcPr>
+          <w:p>
+            <w:r>
+              <w:rPr>
+                <w:b/>
+                <w:bCs/>
+              </w:rPr>
+              <w:t>Query Complexity</w:t>
+            </w:r>
+          </w:p>
+        </w:tc>
+        <w:tc>
+          <w:tcPr>
+            <w:tcW w:w="0" w:type="auto"/>
+            <w:vAlign w:val="center"/>
+            <w:hideMark/>
+          </w:tcPr>
+          <w:p>
+            <w:r>
+              <w:t>Large joins, aggregations → higher DWUs</w:t>
+            </w:r>
+          </w:p>
+        </w:tc>
+      </w:tr>
+      <w:tr>
+        <w:trPr>
+          <w:tblCellSpacing w:w="15" w:type="dxa"/>
+        </w:trPr>
+        <w:tc>
+          <w:tcPr>
+            <w:tcW w:w="0" w:type="auto"/>
+            <w:vAlign w:val="center"/>
+            <w:hideMark/>
+          </w:tcPr>
+          <w:p>
+            <w:r>
+              <w:rPr>
+                <w:b/>
+                <w:bCs/>
+              </w:rPr>
+              <w:t>Load Frequency</w:t>
+            </w:r>
+          </w:p>
+        </w:tc>
+        <w:tc>
+          <w:tcPr>
+            <w:tcW w:w="0" w:type="auto"/>
+            <w:vAlign w:val="center"/>
+            <w:hideMark/>
+          </w:tcPr>
+          <w:p>
+            <w:r>
+              <w:t>Frequent PolyBase loads or copy activity → more compute</w:t>
+            </w:r>
+          </w:p>
+        </w:tc>
+      </w:tr>
+      <w:tr>
+        <w:trPr>
+          <w:tblCellSpacing w:w="15" w:type="dxa"/>
+        </w:trPr>
+        <w:tc>
+          <w:tcPr>
+            <w:tcW w:w="0" w:type="auto"/>
+            <w:vAlign w:val="center"/>
+            <w:hideMark/>
+          </w:tcPr>
+          <w:p>
+            <w:r>
+              <w:rPr>
+                <w:b/>
+                <w:bCs/>
+              </w:rPr>
+              <w:t>Cost Constraints</w:t>
+            </w:r>
+          </w:p>
+        </w:tc>
+        <w:tc>
+          <w:tcPr>
+            <w:tcW w:w="0" w:type="auto"/>
+            <w:vAlign w:val="center"/>
+            <w:hideMark/>
+          </w:tcPr>
+          <w:p>
+            <w:r>
+              <w:t>You can pause and resume dedicated pools to save cost</w:t>
+            </w:r>
+          </w:p>
+        </w:tc>
+      </w:tr>
+    </w:tbl>
+    <w:p>
+      <w:r>
+        <w:pict w14:anchorId="39B0C351">
+          <v:rect id="_x0000_i1136" style="width:0;height:1.5pt" o:hralign="center" o:hrstd="t" o:hr="t" fillcolor="#a0a0a0" stroked="f"/>
+        </w:pict>
+      </w:r>
+    </w:p>
+    <w:p>
+      <w:pPr>
+        <w:rPr>
+          <w:b/>
+          <w:bCs/>
+        </w:rPr>
+      </w:pPr>
+      <w:r>
+        <w:rPr>
+          <w:rFonts w:ascii="Segoe UI Emoji" w:hAnsi="Segoe UI Emoji" w:cs="Segoe UI Emoji"/>
+          <w:b/>
+          <w:bCs/>
+        </w:rPr>
+        <w:t>🔄</w:t>
+      </w:r>
+      <w:r>
+        <w:rPr>
+          <w:b/>
+          <w:bCs/>
+        </w:rPr>
+        <w:t xml:space="preserve"> Scale Up/Down DWUs</w:t>
+      </w:r>
+    </w:p>
+    <w:p>
+      <w:r>
+        <w:t xml:space="preserve">You can </w:t>
+      </w:r>
+      <w:r>
+        <w:rPr>
+          <w:b/>
+          <w:bCs/>
+        </w:rPr>
+        <w:t>scale DWUs up/down</w:t>
+      </w:r>
+      <w:r>
+        <w:t xml:space="preserve"> based on workload:</w:t>
+      </w:r>
+    </w:p>
+    <w:p>
+      <w:r>
+        <w:t>sql</w:t>
+      </w:r>
+    </w:p>
+    <w:p>
+      <w:r>
+        <w:t>CopyEdit</w:t>
+      </w:r>
+    </w:p>
+    <w:p>
+      <w:r>
+        <w:t>-- Scale to DWU1000</w:t>
+      </w:r>
+    </w:p>
+    <w:p>
+      <w:r>
+        <w:t>ALTER DATABASE mydb MODIFY (SERVICE_OBJECTIVE = 'DW1000'</w:t>
+      </w:r>
+      <w:proofErr w:type="gramStart"/>
+      <w:r>
+        <w:t>);</w:t>
+      </w:r>
+      <w:proofErr w:type="gramEnd"/>
+    </w:p>
+    <w:p>
+      <w:r>
+        <w:rPr>
+          <w:rFonts w:ascii="Segoe UI Emoji" w:hAnsi="Segoe UI Emoji" w:cs="Segoe UI Emoji"/>
+        </w:rPr>
+        <w:t>⚠️</w:t>
+      </w:r>
+      <w:r>
+        <w:t xml:space="preserve"> During scale operations, running queries may be interrupted.</w:t>
+      </w:r>
+    </w:p>
+    <w:p>
+      <w:r>
+        <w:pict w14:anchorId="4D41C85A">
+          <v:rect id="_x0000_i1137" style="width:0;height:1.5pt" o:hralign="center" o:hrstd="t" o:hr="t" fillcolor="#a0a0a0" stroked="f"/>
+        </w:pict>
+      </w:r>
+    </w:p>
+    <w:p>
+      <w:pPr>
+        <w:rPr>
+          <w:b/>
+          <w:bCs/>
+        </w:rPr>
+      </w:pPr>
+      <w:r>
+        <w:rPr>
+          <w:rFonts w:ascii="Segoe UI Emoji" w:hAnsi="Segoe UI Emoji" w:cs="Segoe UI Emoji"/>
+          <w:b/>
+          <w:bCs/>
+        </w:rPr>
+        <w:t>💡</w:t>
+      </w:r>
+      <w:r>
+        <w:rPr>
+          <w:b/>
+          <w:bCs/>
+        </w:rPr>
+        <w:t xml:space="preserve"> Tools to Estimate</w:t>
+      </w:r>
+    </w:p>
+    <w:p>
+      <w:pPr>
+        <w:numPr>
+          <w:ilvl w:val="0"/>
+          <w:numId w:val="70"/>
+        </w:numPr>
+      </w:pPr>
+      <w:r>
+        <w:t xml:space="preserve">Use </w:t>
+      </w:r>
+      <w:r>
+        <w:rPr>
+          <w:b/>
+          <w:bCs/>
+        </w:rPr>
+        <w:t>Query Performance Insight</w:t>
+      </w:r>
+      <w:r>
+        <w:t xml:space="preserve"> in Synapse</w:t>
+      </w:r>
+    </w:p>
+    <w:p>
+      <w:pPr>
+        <w:numPr>
+          <w:ilvl w:val="0"/>
+          <w:numId w:val="70"/>
+        </w:numPr>
+      </w:pPr>
+      <w:r>
+        <w:t xml:space="preserve">Monitor </w:t>
+      </w:r>
+      <w:r>
+        <w:rPr>
+          <w:b/>
+          <w:bCs/>
+        </w:rPr>
+        <w:t>resource utilization</w:t>
+      </w:r>
+    </w:p>
+    <w:p>
+      <w:pPr>
+        <w:numPr>
+          <w:ilvl w:val="0"/>
+          <w:numId w:val="70"/>
+        </w:numPr>
+      </w:pPr>
+      <w:r>
+        <w:t xml:space="preserve">Use </w:t>
+      </w:r>
+      <w:r>
+        <w:rPr>
+          <w:b/>
+          <w:bCs/>
+        </w:rPr>
+        <w:t>Query Store</w:t>
+      </w:r>
+      <w:r>
+        <w:t xml:space="preserve"> and </w:t>
+      </w:r>
+      <w:r>
+        <w:rPr>
+          <w:b/>
+          <w:bCs/>
+        </w:rPr>
+        <w:t>DMVs</w:t>
+      </w:r>
+      <w:r>
+        <w:t xml:space="preserve"> like sys.dm_pdw_exec_requests</w:t>
+      </w:r>
+    </w:p>
+    <w:p>
+      <w:r>
+        <w:pict w14:anchorId="6FAFFAEF">
+          <v:rect id="_x0000_i1138" style="width:0;height:1.5pt" o:hralign="center" o:hrstd="t" o:hr="t" fillcolor="#a0a0a0" stroked="f"/>
+        </w:pict>
+      </w:r>
+    </w:p>
+    <w:p>
+      <w:pPr>
+        <w:rPr>
+          <w:b/>
+          <w:bCs/>
+        </w:rPr>
+      </w:pPr>
+      <w:r>
+        <w:rPr>
+          <w:rFonts w:ascii="Segoe UI Emoji" w:hAnsi="Segoe UI Emoji" w:cs="Segoe UI Emoji"/>
+          <w:b/>
+          <w:bCs/>
+        </w:rPr>
+        <w:t>✅</w:t>
+      </w:r>
+      <w:r>
+        <w:rPr>
+          <w:b/>
+          <w:bCs/>
+        </w:rPr>
+        <w:t xml:space="preserve"> Best Practices</w:t>
+      </w:r>
+    </w:p>
+    <w:p>
+      <w:pPr>
+        <w:numPr>
+          <w:ilvl w:val="0"/>
+          <w:numId w:val="71"/>
+        </w:numPr>
+      </w:pPr>
+      <w:r>
+        <w:t xml:space="preserve">Start with </w:t>
+      </w:r>
+      <w:r>
+        <w:rPr>
+          <w:b/>
+          <w:bCs/>
+        </w:rPr>
+        <w:t>DW400 or DW1000</w:t>
+      </w:r>
+      <w:r>
+        <w:t xml:space="preserve"> for pilot projects</w:t>
+      </w:r>
+    </w:p>
+    <w:p>
+      <w:pPr>
+        <w:numPr>
+          <w:ilvl w:val="0"/>
+          <w:numId w:val="71"/>
+        </w:numPr>
+      </w:pPr>
+      <w:r>
+        <w:t>Benchmark and monitor performance</w:t>
+      </w:r>
+    </w:p>
+    <w:p>
+      <w:pPr>
+        <w:numPr>
+          <w:ilvl w:val="0"/>
+          <w:numId w:val="71"/>
+        </w:numPr>
+      </w:pPr>
+      <w:r>
+        <w:t xml:space="preserve">Scale </w:t>
+      </w:r>
+      <w:r>
+        <w:rPr>
+          <w:b/>
+          <w:bCs/>
+        </w:rPr>
+        <w:t>dynamically</w:t>
+      </w:r>
+      <w:r>
+        <w:t xml:space="preserve"> based on peak and off-peak hours</w:t>
+      </w:r>
+    </w:p>
+    <w:p>
+      <w:pPr>
+        <w:numPr>
+          <w:ilvl w:val="0"/>
+          <w:numId w:val="71"/>
+        </w:numPr>
+      </w:pPr>
+      <w:r>
+        <w:rPr>
+          <w:b/>
+          <w:bCs/>
+        </w:rPr>
+        <w:lastRenderedPageBreak/>
+        <w:t>Pause</w:t>
+      </w:r>
+      <w:r>
+        <w:t xml:space="preserve"> when not in use to save costs</w:t>
+      </w:r>
+    </w:p>
     <w:p/>
     <w:sectPr>
       <w:pgSz w:w="12240" w:h="15840"/>
@@ -14321,7 +16034,7 @@
 <w:numbering xmlns:wpc="http://schemas.microsoft.com/office/word/2010/wordprocessingCanvas" xmlns:cx="http://schemas.microsoft.com/office/drawing/2014/chartex" xmlns:cx1="http://schemas.microsoft.com/office/drawing/2015/9/8/chartex" xmlns:cx2="http://schemas.microsoft.com/office/drawing/2015/10/21/chartex" xmlns:cx3="http://schemas.microsoft.com/office/drawing/2016/5/9/chartex" xmlns:cx4="http://schemas.microsoft.com/office/drawing/2016/5/10/chartex" xmlns:cx5="http://schemas.microsoft.com/office/drawing/2016/5/11/chartex" xmlns:cx6="http://schemas.microsoft.com/office/drawing/2016/5/12/chartex" xmlns:cx7="http://schemas.microsoft.com/office/drawing/2016/5/13/chartex" xmlns:cx8="http://schemas.microsoft.com/office/drawing/2016/5/14/chartex" xmlns:mc="http://schemas.openxmlformats.org/markup-compatibility/2006" xmlns:aink="http://schemas.microsoft.com/office/drawing/2016/ink" xmlns:am3d="http://schemas.microsoft.com/office/drawing/2017/model3d" xmlns:o="urn:schemas-microsoft-com:office:office" xmlns:oel="http://schemas.microsoft.com/office/2019/extlst" xmlns:r="http://schemas.openxmlformats.org/officeDocument/2006/relationships" xmlns:m="http://schemas.openxmlformats.org/officeDocument/2006/math" xmlns:v="urn:schemas-microsoft-com:vml" xmlns:wp14="http://schemas.microsoft.com/office/word/2010/wordprocessingDrawing" xmlns:wp="http://schemas.openxmlformats.org/drawingml/2006/wordprocessingDrawing" xmlns:w10="urn:schemas-microsoft-com:office:word" xmlns:w="http://schemas.openxmlformats.org/wordprocessingml/2006/main" xmlns:w14="http://schemas.microsoft.com/office/word/2010/wordml" xmlns:w15="http://schemas.microsoft.com/office/word/2012/wordml" xmlns:w16cex="http://schemas.microsoft.com/office/word/2018/wordml/cex" xmlns:w16cid="http://schemas.microsoft.com/office/word/2016/wordml/cid" xmlns:w16="http://schemas.microsoft.com/office/word/2018/wordml" xmlns:w16du="http://schemas.microsoft.com/office/word/2023/wordml/word16du" xmlns:w16sdtdh="http://schemas.microsoft.com/office/word/2020/wordml/sdtdatahash" xmlns:w16sdtfl="http://schemas.microsoft.com/office/word/2024/wordml/sdtformatlock" xmlns:w16se="http://schemas.microsoft.com/office/word/2015/wordml/symex" xmlns:wpg="http://schemas.microsoft.com/office/word/2010/wordprocessingGroup" xmlns:wpi="http://schemas.microsoft.com/office/word/2010/wordprocessingInk" xmlns:wne="http://schemas.microsoft.com/office/word/2006/wordml" xmlns:wps="http://schemas.microsoft.com/office/word/2010/wordprocessingShape" mc:Ignorable="w14 w15 w16se w16cid w16 w16cex w16sdtdh w16sdtfl w16du wp14">
   <w:numPicBullet w:numPicBulletId="0">
     <w:pict>
-      <v:rect id="_x0000_i1046" style="width:0;height:1.5pt" o:hralign="center" o:bullet="t" o:hrstd="t" o:hr="t" fillcolor="#a0a0a0" stroked="f"/>
+      <v:rect id="_x0000_i1051" style="width:0;height:1.5pt" o:hralign="center" o:bullet="t" o:hrstd="t" o:hr="t" fillcolor="#a0a0a0" stroked="f"/>
     </w:pict>
   </w:numPicBullet>
   <w:abstractNum w:abstractNumId="0" w15:restartNumberingAfterBreak="0">
@@ -18281,6 +19994,155 @@
     </w:lvl>
   </w:abstractNum>
   <w:abstractNum w:abstractNumId="28" w15:restartNumberingAfterBreak="0">
+    <w:nsid w:val="2E2A2C2A"/>
+    <w:multiLevelType w:val="multilevel"/>
+    <w:tmpl w:val="17D6C380"/>
+    <w:lvl w:ilvl="0">
+      <w:start w:val="1"/>
+      <w:numFmt w:val="bullet"/>
+      <w:lvlText w:val=""/>
+      <w:lvlJc w:val="left"/>
+      <w:pPr>
+        <w:tabs>
+          <w:tab w:val="num" w:pos="720"/>
+        </w:tabs>
+        <w:ind w:left="720" w:hanging="360"/>
+      </w:pPr>
+      <w:rPr>
+        <w:rFonts w:ascii="Symbol" w:hAnsi="Symbol" w:hint="default"/>
+        <w:sz w:val="20"/>
+      </w:rPr>
+    </w:lvl>
+    <w:lvl w:ilvl="1" w:tentative="1">
+      <w:start w:val="1"/>
+      <w:numFmt w:val="bullet"/>
+      <w:lvlText w:val="o"/>
+      <w:lvlJc w:val="left"/>
+      <w:pPr>
+        <w:tabs>
+          <w:tab w:val="num" w:pos="1440"/>
+        </w:tabs>
+        <w:ind w:left="1440" w:hanging="360"/>
+      </w:pPr>
+      <w:rPr>
+        <w:rFonts w:ascii="Courier New" w:hAnsi="Courier New" w:hint="default"/>
+        <w:sz w:val="20"/>
+      </w:rPr>
+    </w:lvl>
+    <w:lvl w:ilvl="2" w:tentative="1">
+      <w:start w:val="1"/>
+      <w:numFmt w:val="bullet"/>
+      <w:lvlText w:val=""/>
+      <w:lvlJc w:val="left"/>
+      <w:pPr>
+        <w:tabs>
+          <w:tab w:val="num" w:pos="2160"/>
+        </w:tabs>
+        <w:ind w:left="2160" w:hanging="360"/>
+      </w:pPr>
+      <w:rPr>
+        <w:rFonts w:ascii="Wingdings" w:hAnsi="Wingdings" w:hint="default"/>
+        <w:sz w:val="20"/>
+      </w:rPr>
+    </w:lvl>
+    <w:lvl w:ilvl="3" w:tentative="1">
+      <w:start w:val="1"/>
+      <w:numFmt w:val="bullet"/>
+      <w:lvlText w:val=""/>
+      <w:lvlJc w:val="left"/>
+      <w:pPr>
+        <w:tabs>
+          <w:tab w:val="num" w:pos="2880"/>
+        </w:tabs>
+        <w:ind w:left="2880" w:hanging="360"/>
+      </w:pPr>
+      <w:rPr>
+        <w:rFonts w:ascii="Wingdings" w:hAnsi="Wingdings" w:hint="default"/>
+        <w:sz w:val="20"/>
+      </w:rPr>
+    </w:lvl>
+    <w:lvl w:ilvl="4" w:tentative="1">
+      <w:start w:val="1"/>
+      <w:numFmt w:val="bullet"/>
+      <w:lvlText w:val=""/>
+      <w:lvlJc w:val="left"/>
+      <w:pPr>
+        <w:tabs>
+          <w:tab w:val="num" w:pos="3600"/>
+        </w:tabs>
+        <w:ind w:left="3600" w:hanging="360"/>
+      </w:pPr>
+      <w:rPr>
+        <w:rFonts w:ascii="Wingdings" w:hAnsi="Wingdings" w:hint="default"/>
+        <w:sz w:val="20"/>
+      </w:rPr>
+    </w:lvl>
+    <w:lvl w:ilvl="5" w:tentative="1">
+      <w:start w:val="1"/>
+      <w:numFmt w:val="bullet"/>
+      <w:lvlText w:val=""/>
+      <w:lvlJc w:val="left"/>
+      <w:pPr>
+        <w:tabs>
+          <w:tab w:val="num" w:pos="4320"/>
+        </w:tabs>
+        <w:ind w:left="4320" w:hanging="360"/>
+      </w:pPr>
+      <w:rPr>
+        <w:rFonts w:ascii="Wingdings" w:hAnsi="Wingdings" w:hint="default"/>
+        <w:sz w:val="20"/>
+      </w:rPr>
+    </w:lvl>
+    <w:lvl w:ilvl="6" w:tentative="1">
+      <w:start w:val="1"/>
+      <w:numFmt w:val="bullet"/>
+      <w:lvlText w:val=""/>
+      <w:lvlJc w:val="left"/>
+      <w:pPr>
+        <w:tabs>
+          <w:tab w:val="num" w:pos="5040"/>
+        </w:tabs>
+        <w:ind w:left="5040" w:hanging="360"/>
+      </w:pPr>
+      <w:rPr>
+        <w:rFonts w:ascii="Wingdings" w:hAnsi="Wingdings" w:hint="default"/>
+        <w:sz w:val="20"/>
+      </w:rPr>
+    </w:lvl>
+    <w:lvl w:ilvl="7" w:tentative="1">
+      <w:start w:val="1"/>
+      <w:numFmt w:val="bullet"/>
+      <w:lvlText w:val=""/>
+      <w:lvlJc w:val="left"/>
+      <w:pPr>
+        <w:tabs>
+          <w:tab w:val="num" w:pos="5760"/>
+        </w:tabs>
+        <w:ind w:left="5760" w:hanging="360"/>
+      </w:pPr>
+      <w:rPr>
+        <w:rFonts w:ascii="Wingdings" w:hAnsi="Wingdings" w:hint="default"/>
+        <w:sz w:val="20"/>
+      </w:rPr>
+    </w:lvl>
+    <w:lvl w:ilvl="8" w:tentative="1">
+      <w:start w:val="1"/>
+      <w:numFmt w:val="bullet"/>
+      <w:lvlText w:val=""/>
+      <w:lvlJc w:val="left"/>
+      <w:pPr>
+        <w:tabs>
+          <w:tab w:val="num" w:pos="6480"/>
+        </w:tabs>
+        <w:ind w:left="6480" w:hanging="360"/>
+      </w:pPr>
+      <w:rPr>
+        <w:rFonts w:ascii="Wingdings" w:hAnsi="Wingdings" w:hint="default"/>
+        <w:sz w:val="20"/>
+      </w:rPr>
+    </w:lvl>
+  </w:abstractNum>
+  <w:abstractNum w:abstractNumId="29" w15:restartNumberingAfterBreak="0">
     <w:nsid w:val="307D6DC2"/>
     <w:multiLevelType w:val="multilevel"/>
     <w:tmpl w:val="DE8C24F6"/>
@@ -18393,7 +20255,7 @@
       </w:pPr>
     </w:lvl>
   </w:abstractNum>
-  <w:abstractNum w:abstractNumId="29" w15:restartNumberingAfterBreak="0">
+  <w:abstractNum w:abstractNumId="30" w15:restartNumberingAfterBreak="0">
     <w:nsid w:val="31AB2AEA"/>
     <w:multiLevelType w:val="multilevel"/>
     <w:tmpl w:val="2A16FC34"/>
@@ -18542,7 +20404,7 @@
       </w:rPr>
     </w:lvl>
   </w:abstractNum>
-  <w:abstractNum w:abstractNumId="30" w15:restartNumberingAfterBreak="0">
+  <w:abstractNum w:abstractNumId="31" w15:restartNumberingAfterBreak="0">
     <w:nsid w:val="378C3C2B"/>
     <w:multiLevelType w:val="multilevel"/>
     <w:tmpl w:val="14DA77EE"/>
@@ -18691,7 +20553,7 @@
       </w:rPr>
     </w:lvl>
   </w:abstractNum>
-  <w:abstractNum w:abstractNumId="31" w15:restartNumberingAfterBreak="0">
+  <w:abstractNum w:abstractNumId="32" w15:restartNumberingAfterBreak="0">
     <w:nsid w:val="389E35F2"/>
     <w:multiLevelType w:val="multilevel"/>
     <w:tmpl w:val="69F67CC0"/>
@@ -18840,7 +20702,7 @@
       </w:rPr>
     </w:lvl>
   </w:abstractNum>
-  <w:abstractNum w:abstractNumId="32" w15:restartNumberingAfterBreak="0">
+  <w:abstractNum w:abstractNumId="33" w15:restartNumberingAfterBreak="0">
     <w:nsid w:val="3D9131F9"/>
     <w:multiLevelType w:val="multilevel"/>
     <w:tmpl w:val="B3B25592"/>
@@ -18957,7 +20819,7 @@
       </w:pPr>
     </w:lvl>
   </w:abstractNum>
-  <w:abstractNum w:abstractNumId="33" w15:restartNumberingAfterBreak="0">
+  <w:abstractNum w:abstractNumId="34" w15:restartNumberingAfterBreak="0">
     <w:nsid w:val="3EAB77BF"/>
     <w:multiLevelType w:val="multilevel"/>
     <w:tmpl w:val="47760B96"/>
@@ -19106,7 +20968,7 @@
       </w:rPr>
     </w:lvl>
   </w:abstractNum>
-  <w:abstractNum w:abstractNumId="34" w15:restartNumberingAfterBreak="0">
+  <w:abstractNum w:abstractNumId="35" w15:restartNumberingAfterBreak="0">
     <w:nsid w:val="41936A20"/>
     <w:multiLevelType w:val="multilevel"/>
     <w:tmpl w:val="24ECC188"/>
@@ -19255,7 +21117,7 @@
       </w:rPr>
     </w:lvl>
   </w:abstractNum>
-  <w:abstractNum w:abstractNumId="35" w15:restartNumberingAfterBreak="0">
+  <w:abstractNum w:abstractNumId="36" w15:restartNumberingAfterBreak="0">
     <w:nsid w:val="41A87C2A"/>
     <w:multiLevelType w:val="multilevel"/>
     <w:tmpl w:val="4B603966"/>
@@ -19404,7 +21266,7 @@
       </w:rPr>
     </w:lvl>
   </w:abstractNum>
-  <w:abstractNum w:abstractNumId="36" w15:restartNumberingAfterBreak="0">
+  <w:abstractNum w:abstractNumId="37" w15:restartNumberingAfterBreak="0">
     <w:nsid w:val="452565D9"/>
     <w:multiLevelType w:val="multilevel"/>
     <w:tmpl w:val="0B3A1482"/>
@@ -19553,7 +21415,7 @@
       </w:rPr>
     </w:lvl>
   </w:abstractNum>
-  <w:abstractNum w:abstractNumId="37" w15:restartNumberingAfterBreak="0">
+  <w:abstractNum w:abstractNumId="38" w15:restartNumberingAfterBreak="0">
     <w:nsid w:val="48105A49"/>
     <w:multiLevelType w:val="multilevel"/>
     <w:tmpl w:val="E1C85FAE"/>
@@ -19702,7 +21564,7 @@
       </w:rPr>
     </w:lvl>
   </w:abstractNum>
-  <w:abstractNum w:abstractNumId="38" w15:restartNumberingAfterBreak="0">
+  <w:abstractNum w:abstractNumId="39" w15:restartNumberingAfterBreak="0">
     <w:nsid w:val="492E1C73"/>
     <w:multiLevelType w:val="multilevel"/>
     <w:tmpl w:val="22FC7B58"/>
@@ -19851,7 +21713,7 @@
       </w:rPr>
     </w:lvl>
   </w:abstractNum>
-  <w:abstractNum w:abstractNumId="39" w15:restartNumberingAfterBreak="0">
+  <w:abstractNum w:abstractNumId="40" w15:restartNumberingAfterBreak="0">
     <w:nsid w:val="4B083551"/>
     <w:multiLevelType w:val="multilevel"/>
     <w:tmpl w:val="409C08D0"/>
@@ -20000,7 +21862,7 @@
       </w:rPr>
     </w:lvl>
   </w:abstractNum>
-  <w:abstractNum w:abstractNumId="40" w15:restartNumberingAfterBreak="0">
+  <w:abstractNum w:abstractNumId="41" w15:restartNumberingAfterBreak="0">
     <w:nsid w:val="4F1778FC"/>
     <w:multiLevelType w:val="multilevel"/>
     <w:tmpl w:val="598CDB0C"/>
@@ -20149,7 +22011,7 @@
       </w:rPr>
     </w:lvl>
   </w:abstractNum>
-  <w:abstractNum w:abstractNumId="41" w15:restartNumberingAfterBreak="0">
+  <w:abstractNum w:abstractNumId="42" w15:restartNumberingAfterBreak="0">
     <w:nsid w:val="4F8729F2"/>
     <w:multiLevelType w:val="multilevel"/>
     <w:tmpl w:val="B930E05C"/>
@@ -20298,7 +22160,7 @@
       </w:rPr>
     </w:lvl>
   </w:abstractNum>
-  <w:abstractNum w:abstractNumId="42" w15:restartNumberingAfterBreak="0">
+  <w:abstractNum w:abstractNumId="43" w15:restartNumberingAfterBreak="0">
     <w:nsid w:val="4F8F567E"/>
     <w:multiLevelType w:val="multilevel"/>
     <w:tmpl w:val="AB5C7152"/>
@@ -20447,7 +22309,7 @@
       </w:rPr>
     </w:lvl>
   </w:abstractNum>
-  <w:abstractNum w:abstractNumId="43" w15:restartNumberingAfterBreak="0">
+  <w:abstractNum w:abstractNumId="44" w15:restartNumberingAfterBreak="0">
     <w:nsid w:val="50FB6DEF"/>
     <w:multiLevelType w:val="multilevel"/>
     <w:tmpl w:val="516CFC1E"/>
@@ -20596,7 +22458,7 @@
       </w:rPr>
     </w:lvl>
   </w:abstractNum>
-  <w:abstractNum w:abstractNumId="44" w15:restartNumberingAfterBreak="0">
+  <w:abstractNum w:abstractNumId="45" w15:restartNumberingAfterBreak="0">
     <w:nsid w:val="50FC15C6"/>
     <w:multiLevelType w:val="multilevel"/>
     <w:tmpl w:val="0FB6F63C"/>
@@ -20713,7 +22575,7 @@
       </w:pPr>
     </w:lvl>
   </w:abstractNum>
-  <w:abstractNum w:abstractNumId="45" w15:restartNumberingAfterBreak="0">
+  <w:abstractNum w:abstractNumId="46" w15:restartNumberingAfterBreak="0">
     <w:nsid w:val="51C419E9"/>
     <w:multiLevelType w:val="multilevel"/>
     <w:tmpl w:val="51AA6B12"/>
@@ -20862,7 +22724,7 @@
       </w:rPr>
     </w:lvl>
   </w:abstractNum>
-  <w:abstractNum w:abstractNumId="46" w15:restartNumberingAfterBreak="0">
+  <w:abstractNum w:abstractNumId="47" w15:restartNumberingAfterBreak="0">
     <w:nsid w:val="52141D2A"/>
     <w:multiLevelType w:val="multilevel"/>
     <w:tmpl w:val="1FF66858"/>
@@ -21011,7 +22873,7 @@
       </w:rPr>
     </w:lvl>
   </w:abstractNum>
-  <w:abstractNum w:abstractNumId="47" w15:restartNumberingAfterBreak="0">
+  <w:abstractNum w:abstractNumId="48" w15:restartNumberingAfterBreak="0">
     <w:nsid w:val="523F01EC"/>
     <w:multiLevelType w:val="multilevel"/>
     <w:tmpl w:val="F4F274B2"/>
@@ -21160,7 +23022,7 @@
       </w:rPr>
     </w:lvl>
   </w:abstractNum>
-  <w:abstractNum w:abstractNumId="48" w15:restartNumberingAfterBreak="0">
+  <w:abstractNum w:abstractNumId="49" w15:restartNumberingAfterBreak="0">
     <w:nsid w:val="524E377A"/>
     <w:multiLevelType w:val="multilevel"/>
     <w:tmpl w:val="EA7C45CC"/>
@@ -21309,7 +23171,7 @@
       </w:rPr>
     </w:lvl>
   </w:abstractNum>
-  <w:abstractNum w:abstractNumId="49" w15:restartNumberingAfterBreak="0">
+  <w:abstractNum w:abstractNumId="50" w15:restartNumberingAfterBreak="0">
     <w:nsid w:val="573F5D76"/>
     <w:multiLevelType w:val="multilevel"/>
     <w:tmpl w:val="671C2F78"/>
@@ -21422,7 +23284,7 @@
       </w:pPr>
     </w:lvl>
   </w:abstractNum>
-  <w:abstractNum w:abstractNumId="50" w15:restartNumberingAfterBreak="0">
+  <w:abstractNum w:abstractNumId="51" w15:restartNumberingAfterBreak="0">
     <w:nsid w:val="58B31F25"/>
     <w:multiLevelType w:val="multilevel"/>
     <w:tmpl w:val="E71A5A86"/>
@@ -21571,7 +23433,156 @@
       </w:rPr>
     </w:lvl>
   </w:abstractNum>
-  <w:abstractNum w:abstractNumId="51" w15:restartNumberingAfterBreak="0">
+  <w:abstractNum w:abstractNumId="52" w15:restartNumberingAfterBreak="0">
+    <w:nsid w:val="5DB7730A"/>
+    <w:multiLevelType w:val="multilevel"/>
+    <w:tmpl w:val="27F41100"/>
+    <w:lvl w:ilvl="0">
+      <w:start w:val="1"/>
+      <w:numFmt w:val="bullet"/>
+      <w:lvlText w:val=""/>
+      <w:lvlJc w:val="left"/>
+      <w:pPr>
+        <w:tabs>
+          <w:tab w:val="num" w:pos="720"/>
+        </w:tabs>
+        <w:ind w:left="720" w:hanging="360"/>
+      </w:pPr>
+      <w:rPr>
+        <w:rFonts w:ascii="Symbol" w:hAnsi="Symbol" w:hint="default"/>
+        <w:sz w:val="20"/>
+      </w:rPr>
+    </w:lvl>
+    <w:lvl w:ilvl="1" w:tentative="1">
+      <w:start w:val="1"/>
+      <w:numFmt w:val="bullet"/>
+      <w:lvlText w:val="o"/>
+      <w:lvlJc w:val="left"/>
+      <w:pPr>
+        <w:tabs>
+          <w:tab w:val="num" w:pos="1440"/>
+        </w:tabs>
+        <w:ind w:left="1440" w:hanging="360"/>
+      </w:pPr>
+      <w:rPr>
+        <w:rFonts w:ascii="Courier New" w:hAnsi="Courier New" w:hint="default"/>
+        <w:sz w:val="20"/>
+      </w:rPr>
+    </w:lvl>
+    <w:lvl w:ilvl="2" w:tentative="1">
+      <w:start w:val="1"/>
+      <w:numFmt w:val="bullet"/>
+      <w:lvlText w:val=""/>
+      <w:lvlJc w:val="left"/>
+      <w:pPr>
+        <w:tabs>
+          <w:tab w:val="num" w:pos="2160"/>
+        </w:tabs>
+        <w:ind w:left="2160" w:hanging="360"/>
+      </w:pPr>
+      <w:rPr>
+        <w:rFonts w:ascii="Wingdings" w:hAnsi="Wingdings" w:hint="default"/>
+        <w:sz w:val="20"/>
+      </w:rPr>
+    </w:lvl>
+    <w:lvl w:ilvl="3" w:tentative="1">
+      <w:start w:val="1"/>
+      <w:numFmt w:val="bullet"/>
+      <w:lvlText w:val=""/>
+      <w:lvlJc w:val="left"/>
+      <w:pPr>
+        <w:tabs>
+          <w:tab w:val="num" w:pos="2880"/>
+        </w:tabs>
+        <w:ind w:left="2880" w:hanging="360"/>
+      </w:pPr>
+      <w:rPr>
+        <w:rFonts w:ascii="Wingdings" w:hAnsi="Wingdings" w:hint="default"/>
+        <w:sz w:val="20"/>
+      </w:rPr>
+    </w:lvl>
+    <w:lvl w:ilvl="4" w:tentative="1">
+      <w:start w:val="1"/>
+      <w:numFmt w:val="bullet"/>
+      <w:lvlText w:val=""/>
+      <w:lvlJc w:val="left"/>
+      <w:pPr>
+        <w:tabs>
+          <w:tab w:val="num" w:pos="3600"/>
+        </w:tabs>
+        <w:ind w:left="3600" w:hanging="360"/>
+      </w:pPr>
+      <w:rPr>
+        <w:rFonts w:ascii="Wingdings" w:hAnsi="Wingdings" w:hint="default"/>
+        <w:sz w:val="20"/>
+      </w:rPr>
+    </w:lvl>
+    <w:lvl w:ilvl="5" w:tentative="1">
+      <w:start w:val="1"/>
+      <w:numFmt w:val="bullet"/>
+      <w:lvlText w:val=""/>
+      <w:lvlJc w:val="left"/>
+      <w:pPr>
+        <w:tabs>
+          <w:tab w:val="num" w:pos="4320"/>
+        </w:tabs>
+        <w:ind w:left="4320" w:hanging="360"/>
+      </w:pPr>
+      <w:rPr>
+        <w:rFonts w:ascii="Wingdings" w:hAnsi="Wingdings" w:hint="default"/>
+        <w:sz w:val="20"/>
+      </w:rPr>
+    </w:lvl>
+    <w:lvl w:ilvl="6" w:tentative="1">
+      <w:start w:val="1"/>
+      <w:numFmt w:val="bullet"/>
+      <w:lvlText w:val=""/>
+      <w:lvlJc w:val="left"/>
+      <w:pPr>
+        <w:tabs>
+          <w:tab w:val="num" w:pos="5040"/>
+        </w:tabs>
+        <w:ind w:left="5040" w:hanging="360"/>
+      </w:pPr>
+      <w:rPr>
+        <w:rFonts w:ascii="Wingdings" w:hAnsi="Wingdings" w:hint="default"/>
+        <w:sz w:val="20"/>
+      </w:rPr>
+    </w:lvl>
+    <w:lvl w:ilvl="7" w:tentative="1">
+      <w:start w:val="1"/>
+      <w:numFmt w:val="bullet"/>
+      <w:lvlText w:val=""/>
+      <w:lvlJc w:val="left"/>
+      <w:pPr>
+        <w:tabs>
+          <w:tab w:val="num" w:pos="5760"/>
+        </w:tabs>
+        <w:ind w:left="5760" w:hanging="360"/>
+      </w:pPr>
+      <w:rPr>
+        <w:rFonts w:ascii="Wingdings" w:hAnsi="Wingdings" w:hint="default"/>
+        <w:sz w:val="20"/>
+      </w:rPr>
+    </w:lvl>
+    <w:lvl w:ilvl="8" w:tentative="1">
+      <w:start w:val="1"/>
+      <w:numFmt w:val="bullet"/>
+      <w:lvlText w:val=""/>
+      <w:lvlJc w:val="left"/>
+      <w:pPr>
+        <w:tabs>
+          <w:tab w:val="num" w:pos="6480"/>
+        </w:tabs>
+        <w:ind w:left="6480" w:hanging="360"/>
+      </w:pPr>
+      <w:rPr>
+        <w:rFonts w:ascii="Wingdings" w:hAnsi="Wingdings" w:hint="default"/>
+        <w:sz w:val="20"/>
+      </w:rPr>
+    </w:lvl>
+  </w:abstractNum>
+  <w:abstractNum w:abstractNumId="53" w15:restartNumberingAfterBreak="0">
     <w:nsid w:val="615A126E"/>
     <w:multiLevelType w:val="multilevel"/>
     <w:tmpl w:val="92844A08"/>
@@ -21720,7 +23731,7 @@
       </w:rPr>
     </w:lvl>
   </w:abstractNum>
-  <w:abstractNum w:abstractNumId="52" w15:restartNumberingAfterBreak="0">
+  <w:abstractNum w:abstractNumId="54" w15:restartNumberingAfterBreak="0">
     <w:nsid w:val="6515195C"/>
     <w:multiLevelType w:val="multilevel"/>
     <w:tmpl w:val="3EE6598A"/>
@@ -21869,7 +23880,7 @@
       </w:rPr>
     </w:lvl>
   </w:abstractNum>
-  <w:abstractNum w:abstractNumId="53" w15:restartNumberingAfterBreak="0">
+  <w:abstractNum w:abstractNumId="55" w15:restartNumberingAfterBreak="0">
     <w:nsid w:val="66EA623D"/>
     <w:multiLevelType w:val="multilevel"/>
     <w:tmpl w:val="F11AFE14"/>
@@ -22018,7 +24029,7 @@
       </w:rPr>
     </w:lvl>
   </w:abstractNum>
-  <w:abstractNum w:abstractNumId="54" w15:restartNumberingAfterBreak="0">
+  <w:abstractNum w:abstractNumId="56" w15:restartNumberingAfterBreak="0">
     <w:nsid w:val="67561189"/>
     <w:multiLevelType w:val="multilevel"/>
     <w:tmpl w:val="C74AE602"/>
@@ -22167,7 +24178,7 @@
       </w:rPr>
     </w:lvl>
   </w:abstractNum>
-  <w:abstractNum w:abstractNumId="55" w15:restartNumberingAfterBreak="0">
+  <w:abstractNum w:abstractNumId="57" w15:restartNumberingAfterBreak="0">
     <w:nsid w:val="67654F8C"/>
     <w:multiLevelType w:val="multilevel"/>
     <w:tmpl w:val="D70A4534"/>
@@ -22316,7 +24327,7 @@
       </w:rPr>
     </w:lvl>
   </w:abstractNum>
-  <w:abstractNum w:abstractNumId="56" w15:restartNumberingAfterBreak="0">
+  <w:abstractNum w:abstractNumId="58" w15:restartNumberingAfterBreak="0">
     <w:nsid w:val="67697F55"/>
     <w:multiLevelType w:val="multilevel"/>
     <w:tmpl w:val="67E2AEC6"/>
@@ -22465,7 +24476,7 @@
       </w:rPr>
     </w:lvl>
   </w:abstractNum>
-  <w:abstractNum w:abstractNumId="57" w15:restartNumberingAfterBreak="0">
+  <w:abstractNum w:abstractNumId="59" w15:restartNumberingAfterBreak="0">
     <w:nsid w:val="687A6B33"/>
     <w:multiLevelType w:val="multilevel"/>
     <w:tmpl w:val="A2ECC8BE"/>
@@ -22614,7 +24625,7 @@
       </w:rPr>
     </w:lvl>
   </w:abstractNum>
-  <w:abstractNum w:abstractNumId="58" w15:restartNumberingAfterBreak="0">
+  <w:abstractNum w:abstractNumId="60" w15:restartNumberingAfterBreak="0">
     <w:nsid w:val="69AE7AA5"/>
     <w:multiLevelType w:val="multilevel"/>
     <w:tmpl w:val="B1767644"/>
@@ -22763,7 +24774,7 @@
       </w:rPr>
     </w:lvl>
   </w:abstractNum>
-  <w:abstractNum w:abstractNumId="59" w15:restartNumberingAfterBreak="0">
+  <w:abstractNum w:abstractNumId="61" w15:restartNumberingAfterBreak="0">
     <w:nsid w:val="6A4236B4"/>
     <w:multiLevelType w:val="multilevel"/>
     <w:tmpl w:val="A588FC1A"/>
@@ -22912,7 +24923,7 @@
       </w:rPr>
     </w:lvl>
   </w:abstractNum>
-  <w:abstractNum w:abstractNumId="60" w15:restartNumberingAfterBreak="0">
+  <w:abstractNum w:abstractNumId="62" w15:restartNumberingAfterBreak="0">
     <w:nsid w:val="6AAF1C43"/>
     <w:multiLevelType w:val="multilevel"/>
     <w:tmpl w:val="E12A95E2"/>
@@ -23061,7 +25072,7 @@
       </w:rPr>
     </w:lvl>
   </w:abstractNum>
-  <w:abstractNum w:abstractNumId="61" w15:restartNumberingAfterBreak="0">
+  <w:abstractNum w:abstractNumId="63" w15:restartNumberingAfterBreak="0">
     <w:nsid w:val="6AC30E17"/>
     <w:multiLevelType w:val="multilevel"/>
     <w:tmpl w:val="8612E938"/>
@@ -23210,7 +25221,7 @@
       </w:rPr>
     </w:lvl>
   </w:abstractNum>
-  <w:abstractNum w:abstractNumId="62" w15:restartNumberingAfterBreak="0">
+  <w:abstractNum w:abstractNumId="64" w15:restartNumberingAfterBreak="0">
     <w:nsid w:val="6CA96068"/>
     <w:multiLevelType w:val="multilevel"/>
     <w:tmpl w:val="90F0ED56"/>
@@ -23327,7 +25338,7 @@
       </w:pPr>
     </w:lvl>
   </w:abstractNum>
-  <w:abstractNum w:abstractNumId="63" w15:restartNumberingAfterBreak="0">
+  <w:abstractNum w:abstractNumId="65" w15:restartNumberingAfterBreak="0">
     <w:nsid w:val="6CE60FE8"/>
     <w:multiLevelType w:val="multilevel"/>
     <w:tmpl w:val="BB4E4014"/>
@@ -23476,7 +25487,7 @@
       </w:rPr>
     </w:lvl>
   </w:abstractNum>
-  <w:abstractNum w:abstractNumId="64" w15:restartNumberingAfterBreak="0">
+  <w:abstractNum w:abstractNumId="66" w15:restartNumberingAfterBreak="0">
     <w:nsid w:val="71CE2C93"/>
     <w:multiLevelType w:val="multilevel"/>
     <w:tmpl w:val="7C1A8A68"/>
@@ -23625,7 +25636,120 @@
       </w:rPr>
     </w:lvl>
   </w:abstractNum>
-  <w:abstractNum w:abstractNumId="65" w15:restartNumberingAfterBreak="0">
+  <w:abstractNum w:abstractNumId="67" w15:restartNumberingAfterBreak="0">
+    <w:nsid w:val="71D9548B"/>
+    <w:multiLevelType w:val="multilevel"/>
+    <w:tmpl w:val="47EEE752"/>
+    <w:lvl w:ilvl="0">
+      <w:start w:val="1"/>
+      <w:numFmt w:val="decimal"/>
+      <w:lvlText w:val="%1."/>
+      <w:lvlJc w:val="left"/>
+      <w:pPr>
+        <w:tabs>
+          <w:tab w:val="num" w:pos="720"/>
+        </w:tabs>
+        <w:ind w:left="720" w:hanging="360"/>
+      </w:pPr>
+    </w:lvl>
+    <w:lvl w:ilvl="1" w:tentative="1">
+      <w:start w:val="1"/>
+      <w:numFmt w:val="decimal"/>
+      <w:lvlText w:val="%2."/>
+      <w:lvlJc w:val="left"/>
+      <w:pPr>
+        <w:tabs>
+          <w:tab w:val="num" w:pos="1440"/>
+        </w:tabs>
+        <w:ind w:left="1440" w:hanging="360"/>
+      </w:pPr>
+    </w:lvl>
+    <w:lvl w:ilvl="2" w:tentative="1">
+      <w:start w:val="1"/>
+      <w:numFmt w:val="decimal"/>
+      <w:lvlText w:val="%3."/>
+      <w:lvlJc w:val="left"/>
+      <w:pPr>
+        <w:tabs>
+          <w:tab w:val="num" w:pos="2160"/>
+        </w:tabs>
+        <w:ind w:left="2160" w:hanging="360"/>
+      </w:pPr>
+    </w:lvl>
+    <w:lvl w:ilvl="3" w:tentative="1">
+      <w:start w:val="1"/>
+      <w:numFmt w:val="decimal"/>
+      <w:lvlText w:val="%4."/>
+      <w:lvlJc w:val="left"/>
+      <w:pPr>
+        <w:tabs>
+          <w:tab w:val="num" w:pos="2880"/>
+        </w:tabs>
+        <w:ind w:left="2880" w:hanging="360"/>
+      </w:pPr>
+    </w:lvl>
+    <w:lvl w:ilvl="4" w:tentative="1">
+      <w:start w:val="1"/>
+      <w:numFmt w:val="decimal"/>
+      <w:lvlText w:val="%5."/>
+      <w:lvlJc w:val="left"/>
+      <w:pPr>
+        <w:tabs>
+          <w:tab w:val="num" w:pos="3600"/>
+        </w:tabs>
+        <w:ind w:left="3600" w:hanging="360"/>
+      </w:pPr>
+    </w:lvl>
+    <w:lvl w:ilvl="5" w:tentative="1">
+      <w:start w:val="1"/>
+      <w:numFmt w:val="decimal"/>
+      <w:lvlText w:val="%6."/>
+      <w:lvlJc w:val="left"/>
+      <w:pPr>
+        <w:tabs>
+          <w:tab w:val="num" w:pos="4320"/>
+        </w:tabs>
+        <w:ind w:left="4320" w:hanging="360"/>
+      </w:pPr>
+    </w:lvl>
+    <w:lvl w:ilvl="6" w:tentative="1">
+      <w:start w:val="1"/>
+      <w:numFmt w:val="decimal"/>
+      <w:lvlText w:val="%7."/>
+      <w:lvlJc w:val="left"/>
+      <w:pPr>
+        <w:tabs>
+          <w:tab w:val="num" w:pos="5040"/>
+        </w:tabs>
+        <w:ind w:left="5040" w:hanging="360"/>
+      </w:pPr>
+    </w:lvl>
+    <w:lvl w:ilvl="7" w:tentative="1">
+      <w:start w:val="1"/>
+      <w:numFmt w:val="decimal"/>
+      <w:lvlText w:val="%8."/>
+      <w:lvlJc w:val="left"/>
+      <w:pPr>
+        <w:tabs>
+          <w:tab w:val="num" w:pos="5760"/>
+        </w:tabs>
+        <w:ind w:left="5760" w:hanging="360"/>
+      </w:pPr>
+    </w:lvl>
+    <w:lvl w:ilvl="8" w:tentative="1">
+      <w:start w:val="1"/>
+      <w:numFmt w:val="decimal"/>
+      <w:lvlText w:val="%9."/>
+      <w:lvlJc w:val="left"/>
+      <w:pPr>
+        <w:tabs>
+          <w:tab w:val="num" w:pos="6480"/>
+        </w:tabs>
+        <w:ind w:left="6480" w:hanging="360"/>
+      </w:pPr>
+    </w:lvl>
+  </w:abstractNum>
+  <w:abstractNum w:abstractNumId="68" w15:restartNumberingAfterBreak="0">
     <w:nsid w:val="76AB54BE"/>
     <w:multiLevelType w:val="multilevel"/>
     <w:tmpl w:val="6ECE5002"/>
@@ -23774,7 +25898,7 @@
       </w:rPr>
     </w:lvl>
   </w:abstractNum>
-  <w:abstractNum w:abstractNumId="66" w15:restartNumberingAfterBreak="0">
+  <w:abstractNum w:abstractNumId="69" w15:restartNumberingAfterBreak="0">
     <w:nsid w:val="76E500BF"/>
     <w:multiLevelType w:val="multilevel"/>
     <w:tmpl w:val="8E7EEF0A"/>
@@ -23923,7 +26047,7 @@
       </w:rPr>
     </w:lvl>
   </w:abstractNum>
-  <w:abstractNum w:abstractNumId="67" w15:restartNumberingAfterBreak="0">
+  <w:abstractNum w:abstractNumId="70" w15:restartNumberingAfterBreak="0">
     <w:nsid w:val="7C7C6510"/>
     <w:multiLevelType w:val="multilevel"/>
     <w:tmpl w:val="BF34BD92"/>
@@ -24073,7 +26197,7 @@
     </w:lvl>
   </w:abstractNum>
   <w:num w:numId="1" w16cid:durableId="1377043119">
-    <w:abstractNumId w:val="60"/>
+    <w:abstractNumId w:val="62"/>
   </w:num>
   <w:num w:numId="2" w16cid:durableId="1417287711">
     <w:abstractNumId w:val="13"/>
@@ -24082,19 +26206,19 @@
     <w:abstractNumId w:val="18"/>
   </w:num>
   <w:num w:numId="4" w16cid:durableId="775179129">
-    <w:abstractNumId w:val="56"/>
+    <w:abstractNumId w:val="58"/>
   </w:num>
   <w:num w:numId="5" w16cid:durableId="403575120">
     <w:abstractNumId w:val="17"/>
   </w:num>
   <w:num w:numId="6" w16cid:durableId="1101337422">
-    <w:abstractNumId w:val="46"/>
+    <w:abstractNumId w:val="47"/>
   </w:num>
   <w:num w:numId="7" w16cid:durableId="42218321">
-    <w:abstractNumId w:val="48"/>
+    <w:abstractNumId w:val="49"/>
   </w:num>
   <w:num w:numId="8" w16cid:durableId="559100201">
-    <w:abstractNumId w:val="50"/>
+    <w:abstractNumId w:val="51"/>
   </w:num>
   <w:num w:numId="9" w16cid:durableId="510148802">
     <w:abstractNumId w:val="15"/>
@@ -24106,19 +26230,19 @@
     <w:abstractNumId w:val="19"/>
   </w:num>
   <w:num w:numId="12" w16cid:durableId="793523508">
-    <w:abstractNumId w:val="38"/>
+    <w:abstractNumId w:val="39"/>
   </w:num>
   <w:num w:numId="13" w16cid:durableId="195509991">
-    <w:abstractNumId w:val="40"/>
+    <w:abstractNumId w:val="41"/>
   </w:num>
   <w:num w:numId="14" w16cid:durableId="79299843">
-    <w:abstractNumId w:val="59"/>
+    <w:abstractNumId w:val="61"/>
   </w:num>
   <w:num w:numId="15" w16cid:durableId="1320303022">
-    <w:abstractNumId w:val="51"/>
+    <w:abstractNumId w:val="53"/>
   </w:num>
   <w:num w:numId="16" w16cid:durableId="372534585">
-    <w:abstractNumId w:val="34"/>
+    <w:abstractNumId w:val="35"/>
   </w:num>
   <w:num w:numId="17" w16cid:durableId="1488014505">
     <w:abstractNumId w:val="9"/>
@@ -24130,13 +26254,13 @@
     <w:abstractNumId w:val="27"/>
   </w:num>
   <w:num w:numId="20" w16cid:durableId="1602689793">
-    <w:abstractNumId w:val="65"/>
+    <w:abstractNumId w:val="68"/>
   </w:num>
   <w:num w:numId="21" w16cid:durableId="841554534">
-    <w:abstractNumId w:val="39"/>
+    <w:abstractNumId w:val="40"/>
   </w:num>
   <w:num w:numId="22" w16cid:durableId="1860195826">
-    <w:abstractNumId w:val="66"/>
+    <w:abstractNumId w:val="69"/>
   </w:num>
   <w:num w:numId="23" w16cid:durableId="1427771768">
     <w:abstractNumId w:val="4"/>
@@ -24145,13 +26269,13 @@
     <w:abstractNumId w:val="14"/>
   </w:num>
   <w:num w:numId="25" w16cid:durableId="75133540">
-    <w:abstractNumId w:val="45"/>
+    <w:abstractNumId w:val="46"/>
   </w:num>
   <w:num w:numId="26" w16cid:durableId="1777022903">
-    <w:abstractNumId w:val="53"/>
+    <w:abstractNumId w:val="55"/>
   </w:num>
   <w:num w:numId="27" w16cid:durableId="698244473">
-    <w:abstractNumId w:val="35"/>
+    <w:abstractNumId w:val="36"/>
   </w:num>
   <w:num w:numId="28" w16cid:durableId="1131556092">
     <w:abstractNumId w:val="1"/>
@@ -24163,34 +26287,34 @@
     <w:abstractNumId w:val="25"/>
   </w:num>
   <w:num w:numId="31" w16cid:durableId="774247806">
-    <w:abstractNumId w:val="47"/>
+    <w:abstractNumId w:val="48"/>
   </w:num>
   <w:num w:numId="32" w16cid:durableId="299388117">
-    <w:abstractNumId w:val="32"/>
+    <w:abstractNumId w:val="33"/>
   </w:num>
   <w:num w:numId="33" w16cid:durableId="1602059317">
-    <w:abstractNumId w:val="43"/>
+    <w:abstractNumId w:val="44"/>
   </w:num>
   <w:num w:numId="34" w16cid:durableId="383261850">
-    <w:abstractNumId w:val="36"/>
+    <w:abstractNumId w:val="37"/>
   </w:num>
   <w:num w:numId="35" w16cid:durableId="1144665275">
     <w:abstractNumId w:val="11"/>
   </w:num>
   <w:num w:numId="36" w16cid:durableId="965627419">
-    <w:abstractNumId w:val="58"/>
+    <w:abstractNumId w:val="60"/>
   </w:num>
   <w:num w:numId="37" w16cid:durableId="1325276578">
-    <w:abstractNumId w:val="63"/>
+    <w:abstractNumId w:val="65"/>
   </w:num>
   <w:num w:numId="38" w16cid:durableId="1381784606">
-    <w:abstractNumId w:val="62"/>
+    <w:abstractNumId w:val="64"/>
   </w:num>
   <w:num w:numId="39" w16cid:durableId="1846246991">
-    <w:abstractNumId w:val="42"/>
+    <w:abstractNumId w:val="43"/>
   </w:num>
   <w:num w:numId="40" w16cid:durableId="665321558">
-    <w:abstractNumId w:val="55"/>
+    <w:abstractNumId w:val="57"/>
   </w:num>
   <w:num w:numId="41" w16cid:durableId="1089887619">
     <w:abstractNumId w:val="7"/>
@@ -24199,13 +26323,13 @@
     <w:abstractNumId w:val="24"/>
   </w:num>
   <w:num w:numId="43" w16cid:durableId="269093516">
-    <w:abstractNumId w:val="29"/>
+    <w:abstractNumId w:val="30"/>
   </w:num>
   <w:num w:numId="44" w16cid:durableId="1645357594">
-    <w:abstractNumId w:val="41"/>
+    <w:abstractNumId w:val="42"/>
   </w:num>
   <w:num w:numId="45" w16cid:durableId="807816074">
-    <w:abstractNumId w:val="52"/>
+    <w:abstractNumId w:val="54"/>
   </w:num>
   <w:num w:numId="46" w16cid:durableId="1726099642">
     <w:abstractNumId w:val="16"/>
@@ -24217,22 +26341,22 @@
     <w:abstractNumId w:val="20"/>
   </w:num>
   <w:num w:numId="49" w16cid:durableId="1202397573">
-    <w:abstractNumId w:val="49"/>
+    <w:abstractNumId w:val="50"/>
   </w:num>
   <w:num w:numId="50" w16cid:durableId="573054672">
-    <w:abstractNumId w:val="28"/>
+    <w:abstractNumId w:val="29"/>
   </w:num>
   <w:num w:numId="51" w16cid:durableId="877812322">
     <w:abstractNumId w:val="8"/>
   </w:num>
   <w:num w:numId="52" w16cid:durableId="2001349042">
-    <w:abstractNumId w:val="44"/>
+    <w:abstractNumId w:val="45"/>
   </w:num>
   <w:num w:numId="53" w16cid:durableId="2026132817">
     <w:abstractNumId w:val="0"/>
   </w:num>
   <w:num w:numId="54" w16cid:durableId="371081670">
-    <w:abstractNumId w:val="64"/>
+    <w:abstractNumId w:val="66"/>
   </w:num>
   <w:num w:numId="55" w16cid:durableId="2124642165">
     <w:abstractNumId w:val="10"/>
@@ -24241,10 +26365,10 @@
     <w:abstractNumId w:val="6"/>
   </w:num>
   <w:num w:numId="57" w16cid:durableId="1414547034">
-    <w:abstractNumId w:val="61"/>
+    <w:abstractNumId w:val="63"/>
   </w:num>
   <w:num w:numId="58" w16cid:durableId="1142767863">
-    <w:abstractNumId w:val="54"/>
+    <w:abstractNumId w:val="56"/>
   </w:num>
   <w:num w:numId="59" w16cid:durableId="2116291138">
     <w:abstractNumId w:val="2"/>
@@ -24256,25 +26380,34 @@
     <w:abstractNumId w:val="12"/>
   </w:num>
   <w:num w:numId="62" w16cid:durableId="1698121452">
-    <w:abstractNumId w:val="57"/>
+    <w:abstractNumId w:val="59"/>
   </w:num>
   <w:num w:numId="63" w16cid:durableId="212278500">
-    <w:abstractNumId w:val="37"/>
+    <w:abstractNumId w:val="38"/>
   </w:num>
   <w:num w:numId="64" w16cid:durableId="55472475">
-    <w:abstractNumId w:val="67"/>
+    <w:abstractNumId w:val="70"/>
   </w:num>
   <w:num w:numId="65" w16cid:durableId="1674576079">
     <w:abstractNumId w:val="22"/>
   </w:num>
   <w:num w:numId="66" w16cid:durableId="1975981401">
-    <w:abstractNumId w:val="33"/>
+    <w:abstractNumId w:val="34"/>
   </w:num>
   <w:num w:numId="67" w16cid:durableId="1036657986">
-    <w:abstractNumId w:val="30"/>
+    <w:abstractNumId w:val="31"/>
   </w:num>
   <w:num w:numId="68" w16cid:durableId="530529546">
-    <w:abstractNumId w:val="31"/>
+    <w:abstractNumId w:val="32"/>
+  </w:num>
+  <w:num w:numId="69" w16cid:durableId="1576620616">
+    <w:abstractNumId w:val="67"/>
+  </w:num>
+  <w:num w:numId="70" w16cid:durableId="1375427767">
+    <w:abstractNumId w:val="52"/>
+  </w:num>
+  <w:num w:numId="71" w16cid:durableId="1594628865">
+    <w:abstractNumId w:val="28"/>
   </w:num>
 </w:numbering>
 </file>

</xml_diff>